<commit_message>
Deploying to gh-pages from @ Morrison-Lab/sds@8a2534b4e38463be611c0b89ba5fdc7dcf791116 🚀
</commit_message>
<xml_diff>
--- a/inference-handout.docx
+++ b/inference-handout.docx
@@ -15,7 +15,7 @@
         <w:pStyle w:val="Date"/>
       </w:pPr>
       <w:r>
-        <w:t xml:space="preserve">Last modified: 2026-10-26 09:42:48 (PDT)</w:t>
+        <w:t xml:space="preserve">Last modified: 2026-10-26 09:58:58 (PDT)</w:t>
       </w:r>
     </w:p>
     <w:bookmarkStart w:id="12" w:name="inference"/>
@@ -5351,7 +5351,7 @@
     </w:p>
     <w:bookmarkEnd w:id="35"/>
     <w:bookmarkEnd w:id="36"/>
-    <w:bookmarkStart w:id="45" w:name="sec-CI"/>
+    <w:bookmarkStart w:id="57" w:name="sec-CI"/>
     <w:p>
       <w:pPr>
         <w:pStyle w:val="Heading2"/>
@@ -5360,7 +5360,7 @@
         <w:t xml:space="preserve">4 Confidence intervals</w:t>
       </w:r>
     </w:p>
-    <w:bookmarkStart w:id="37" w:name="def-confidence-interval"/>
+    <w:bookmarkStart w:id="39" w:name="def-confidence-interval"/>
     <w:p>
       <w:pPr>
         <w:pStyle w:val="FirstParagraph"/>
@@ -5444,7 +5444,95 @@
         <w:t xml:space="preserve"> </w:t>
       </w:r>
       <w:r>
-        <w:t xml:space="preserve">is a pair of statistics</w:t>
+        <w:t xml:space="preserve">is a random</w:t>
+      </w:r>
+      <w:r>
+        <w:t xml:space="preserve"> </w:t>
+      </w:r>
+      <w:hyperlink r:id="rId37">
+        <w:r>
+          <w:rPr>
+            <w:rStyle w:val="Hyperlink"/>
+          </w:rPr>
+          <w:t xml:space="preserve">closed interval</w:t>
+        </w:r>
+      </w:hyperlink>
+      <w:r>
+        <w:t xml:space="preserve"> </w:t>
+      </w:r>
+      <m:oMath>
+        <m:r>
+          <m:t>​</m:t>
+        </m:r>
+        <m:d>
+          <m:dPr>
+            <m:begChr m:val="["/>
+            <m:sepChr m:val=""/>
+            <m:endChr m:val="]"/>
+            <m:grow/>
+          </m:dPr>
+          <m:e>
+            <m:r>
+              <m:t>L</m:t>
+            </m:r>
+            <m:r>
+              <m:t>​</m:t>
+            </m:r>
+            <m:d>
+              <m:dPr>
+                <m:begChr m:val="("/>
+                <m:sepChr m:val=""/>
+                <m:endChr m:val=")"/>
+                <m:grow/>
+              </m:dPr>
+              <m:e>
+                <m:r>
+                  <m:t>X</m:t>
+                </m:r>
+              </m:e>
+            </m:d>
+            <m:r>
+              <m:t>​</m:t>
+            </m:r>
+            <m:r>
+              <m:rPr>
+                <m:sty m:val="p"/>
+              </m:rPr>
+              <m:t>,</m:t>
+            </m:r>
+            <m:r>
+              <m:t>U</m:t>
+            </m:r>
+            <m:r>
+              <m:t>​</m:t>
+            </m:r>
+            <m:d>
+              <m:dPr>
+                <m:begChr m:val="("/>
+                <m:sepChr m:val=""/>
+                <m:endChr m:val=")"/>
+                <m:grow/>
+              </m:dPr>
+              <m:e>
+                <m:r>
+                  <m:t>X</m:t>
+                </m:r>
+              </m:e>
+            </m:d>
+            <m:r>
+              <m:t>​</m:t>
+            </m:r>
+          </m:e>
+        </m:d>
+        <m:r>
+          <m:t>​</m:t>
+        </m:r>
+      </m:oMath>
+      <w:r>
+        <w:t xml:space="preserve"> </w:t>
+      </w:r>
+      <w:r>
+        <w:t xml:space="preserve">whose endpoints</w:t>
       </w:r>
       <w:r>
         <w:t xml:space="preserve"> </w:t>
@@ -5453,23 +5541,87 @@
         <m:r>
           <m:t>L</m:t>
         </m:r>
-      </m:oMath>
-      <w:r>
-        <w:t xml:space="preserve"> </w:t>
-      </w:r>
-      <w:r>
-        <w:t xml:space="preserve">and</w:t>
-      </w:r>
-      <w:r>
-        <w:t xml:space="preserve"> </w:t>
-      </w:r>
-      <m:oMath>
+        <m:r>
+          <m:t>​</m:t>
+        </m:r>
+        <m:d>
+          <m:dPr>
+            <m:begChr m:val="("/>
+            <m:sepChr m:val=""/>
+            <m:endChr m:val=")"/>
+            <m:grow/>
+          </m:dPr>
+          <m:e>
+            <m:r>
+              <m:t>X</m:t>
+            </m:r>
+          </m:e>
+        </m:d>
+        <m:r>
+          <m:t>​</m:t>
+        </m:r>
+        <m:r>
+          <m:rPr>
+            <m:sty m:val="p"/>
+          </m:rPr>
+          <m:t>≤</m:t>
+        </m:r>
         <m:r>
           <m:t>U</m:t>
         </m:r>
-      </m:oMath>
-      <w:r>
-        <w:t xml:space="preserve">, computed from the data,</w:t>
+        <m:r>
+          <m:t>​</m:t>
+        </m:r>
+        <m:d>
+          <m:dPr>
+            <m:begChr m:val="("/>
+            <m:sepChr m:val=""/>
+            <m:endChr m:val=")"/>
+            <m:grow/>
+          </m:dPr>
+          <m:e>
+            <m:r>
+              <m:t>X</m:t>
+            </m:r>
+          </m:e>
+        </m:d>
+        <m:r>
+          <m:t>​</m:t>
+        </m:r>
+      </m:oMath>
+      <w:r>
+        <w:t xml:space="preserve"> </w:t>
+      </w:r>
+      <w:r>
+        <w:t xml:space="preserve">are</w:t>
+      </w:r>
+      <w:r>
+        <w:t xml:space="preserve"> </w:t>
+      </w:r>
+      <w:hyperlink r:id="rId38">
+        <w:r>
+          <w:rPr>
+            <w:rStyle w:val="Hyperlink"/>
+          </w:rPr>
+          <w:t xml:space="preserve">statistics</w:t>
+        </w:r>
+      </w:hyperlink>
+      <w:r>
+        <w:t xml:space="preserve"> </w:t>
+      </w:r>
+      <w:r>
+        <w:t xml:space="preserve">computed from the data</w:t>
+      </w:r>
+      <w:r>
+        <w:t xml:space="preserve"> </w:t>
+      </w:r>
+      <m:oMath>
+        <m:r>
+          <m:t>X</m:t>
+        </m:r>
+      </m:oMath>
+      <w:r>
+        <w:t xml:space="preserve">,</w:t>
       </w:r>
       <w:r>
         <w:t xml:space="preserve"> </w:t>
@@ -5498,50 +5650,117 @@
           <m:jc m:val="center"/>
         </m:oMathParaPr>
         <m:oMath>
+          <m:limLow>
+            <m:e>
+              <m:r>
+                <m:rPr>
+                  <m:sty m:val="p"/>
+                </m:rPr>
+                <m:t>Pr</m:t>
+              </m:r>
+            </m:e>
+            <m:lim>
+              <m:r>
+                <m:t>θ</m:t>
+              </m:r>
+            </m:lim>
+          </m:limLow>
           <m:r>
-            <m:rPr>
-              <m:sty m:val="p"/>
-            </m:rPr>
-            <m:t>Pr</m:t>
+            <m:t>​</m:t>
+          </m:r>
+          <m:d>
+            <m:dPr>
+              <m:begChr m:val="("/>
+              <m:sepChr m:val=""/>
+              <m:endChr m:val=")"/>
+              <m:grow/>
+            </m:dPr>
+            <m:e>
+              <m:r>
+                <m:t>θ</m:t>
+              </m:r>
+              <m:r>
+                <m:rPr>
+                  <m:sty m:val="p"/>
+                </m:rPr>
+                <m:t>∈</m:t>
+              </m:r>
+              <m:r>
+                <m:t>​</m:t>
+              </m:r>
+              <m:d>
+                <m:dPr>
+                  <m:begChr m:val="["/>
+                  <m:sepChr m:val=""/>
+                  <m:endChr m:val="]"/>
+                  <m:grow/>
+                </m:dPr>
+                <m:e>
+                  <m:r>
+                    <m:t>L</m:t>
+                  </m:r>
+                  <m:r>
+                    <m:t>​</m:t>
+                  </m:r>
+                  <m:d>
+                    <m:dPr>
+                      <m:begChr m:val="("/>
+                      <m:sepChr m:val=""/>
+                      <m:endChr m:val=")"/>
+                      <m:grow/>
+                    </m:dPr>
+                    <m:e>
+                      <m:r>
+                        <m:t>X</m:t>
+                      </m:r>
+                    </m:e>
+                  </m:d>
+                  <m:r>
+                    <m:t>​</m:t>
+                  </m:r>
+                  <m:r>
+                    <m:rPr>
+                      <m:sty m:val="p"/>
+                    </m:rPr>
+                    <m:t>,</m:t>
+                  </m:r>
+                  <m:r>
+                    <m:t>U</m:t>
+                  </m:r>
+                  <m:r>
+                    <m:t>​</m:t>
+                  </m:r>
+                  <m:d>
+                    <m:dPr>
+                      <m:begChr m:val="("/>
+                      <m:sepChr m:val=""/>
+                      <m:endChr m:val=")"/>
+                      <m:grow/>
+                    </m:dPr>
+                    <m:e>
+                      <m:r>
+                        <m:t>X</m:t>
+                      </m:r>
+                    </m:e>
+                  </m:d>
+                  <m:r>
+                    <m:t>​</m:t>
+                  </m:r>
+                </m:e>
+              </m:d>
+              <m:r>
+                <m:t>​</m:t>
+              </m:r>
+            </m:e>
+          </m:d>
+          <m:r>
+            <m:t>​</m:t>
           </m:r>
           <m:r>
             <m:rPr>
               <m:sty m:val="p"/>
             </m:rPr>
-            <m:t>(</m:t>
-          </m:r>
-          <m:r>
-            <m:t>L</m:t>
-          </m:r>
-          <m:r>
-            <m:rPr>
-              <m:sty m:val="p"/>
-            </m:rPr>
-            <m:t>≤</m:t>
-          </m:r>
-          <m:r>
-            <m:t>θ</m:t>
-          </m:r>
-          <m:r>
-            <m:rPr>
-              <m:sty m:val="p"/>
-            </m:rPr>
-            <m:t>≤</m:t>
-          </m:r>
-          <m:r>
-            <m:t>U</m:t>
-          </m:r>
-          <m:r>
-            <m:rPr>
-              <m:sty m:val="p"/>
-            </m:rPr>
-            <m:t>)</m:t>
-          </m:r>
-          <m:r>
-            <m:rPr>
-              <m:sty m:val="p"/>
-            </m:rPr>
-            <m:t>=</m:t>
+            <m:t>≥</m:t>
           </m:r>
           <m:r>
             <m:t>1</m:t>
@@ -5585,6 +5804,26 @@
       <w:r>
         <w:t xml:space="preserve">held fixed.</w:t>
       </w:r>
+      <w:r>
+        <w:t xml:space="preserve"> </w:t>
+      </w:r>
+      <w:r>
+        <w:t xml:space="preserve">The interval is random and</w:t>
+      </w:r>
+      <w:r>
+        <w:t xml:space="preserve"> </w:t>
+      </w:r>
+      <m:oMath>
+        <m:r>
+          <m:t>θ</m:t>
+        </m:r>
+      </m:oMath>
+      <w:r>
+        <w:t xml:space="preserve"> </w:t>
+      </w:r>
+      <w:r>
+        <w:t xml:space="preserve">is not.</w:t>
+      </w:r>
     </w:p>
     <w:p>
       <w:pPr>
@@ -5597,14 +5836,14 @@
         <w:t xml:space="preserve"> </w:t>
       </w:r>
       <w:r>
-        <w:t xml:space="preserve">Wikipedia contributors [13]</w:t>
+        <w:t xml:space="preserve">[9], Definitions 9.1.1, 9.1.4 and 9.1.5</w:t>
       </w:r>
       <w:r>
         <w:t xml:space="preserve">.</w:t>
       </w:r>
     </w:p>
-    <w:bookmarkEnd w:id="37"/>
-    <w:bookmarkStart w:id="38" w:name="def-coverage-probability"/>
+    <w:bookmarkEnd w:id="39"/>
+    <w:bookmarkStart w:id="40" w:name="def-coverage-probability"/>
     <w:p>
       <w:pPr>
         <w:pStyle w:val="BodyText"/>
@@ -5643,28 +5882,70 @@
       </w:r>
       <m:oMath>
         <m:r>
-          <m:rPr>
-            <m:sty m:val="p"/>
-          </m:rPr>
-          <m:t>[</m:t>
-        </m:r>
-        <m:r>
-          <m:t>L</m:t>
-        </m:r>
-        <m:r>
-          <m:rPr>
-            <m:sty m:val="p"/>
-          </m:rPr>
-          <m:t>,</m:t>
-        </m:r>
-        <m:r>
-          <m:t>U</m:t>
-        </m:r>
-        <m:r>
-          <m:rPr>
-            <m:sty m:val="p"/>
-          </m:rPr>
-          <m:t>]</m:t>
+          <m:t>​</m:t>
+        </m:r>
+        <m:d>
+          <m:dPr>
+            <m:begChr m:val="["/>
+            <m:sepChr m:val=""/>
+            <m:endChr m:val="]"/>
+            <m:grow/>
+          </m:dPr>
+          <m:e>
+            <m:r>
+              <m:t>L</m:t>
+            </m:r>
+            <m:r>
+              <m:t>​</m:t>
+            </m:r>
+            <m:d>
+              <m:dPr>
+                <m:begChr m:val="("/>
+                <m:sepChr m:val=""/>
+                <m:endChr m:val=")"/>
+                <m:grow/>
+              </m:dPr>
+              <m:e>
+                <m:r>
+                  <m:t>X</m:t>
+                </m:r>
+              </m:e>
+            </m:d>
+            <m:r>
+              <m:t>​</m:t>
+            </m:r>
+            <m:r>
+              <m:rPr>
+                <m:sty m:val="p"/>
+              </m:rPr>
+              <m:t>,</m:t>
+            </m:r>
+            <m:r>
+              <m:t>U</m:t>
+            </m:r>
+            <m:r>
+              <m:t>​</m:t>
+            </m:r>
+            <m:d>
+              <m:dPr>
+                <m:begChr m:val="("/>
+                <m:sepChr m:val=""/>
+                <m:endChr m:val=")"/>
+                <m:grow/>
+              </m:dPr>
+              <m:e>
+                <m:r>
+                  <m:t>X</m:t>
+                </m:r>
+              </m:e>
+            </m:d>
+            <m:r>
+              <m:t>​</m:t>
+            </m:r>
+          </m:e>
+        </m:d>
+        <m:r>
+          <m:t>​</m:t>
         </m:r>
       </m:oMath>
       <w:r>
@@ -5691,44 +5972,111 @@
         <w:t xml:space="preserve"> </w:t>
       </w:r>
       <m:oMath>
-        <m:r>
-          <m:rPr>
-            <m:sty m:val="p"/>
-          </m:rPr>
-          <m:t>Pr</m:t>
-        </m:r>
-        <m:r>
-          <m:rPr>
-            <m:sty m:val="p"/>
-          </m:rPr>
-          <m:t>(</m:t>
-        </m:r>
-        <m:r>
-          <m:t>L</m:t>
-        </m:r>
-        <m:r>
-          <m:rPr>
-            <m:sty m:val="p"/>
-          </m:rPr>
-          <m:t>≤</m:t>
-        </m:r>
-        <m:r>
-          <m:t>θ</m:t>
-        </m:r>
-        <m:r>
-          <m:rPr>
-            <m:sty m:val="p"/>
-          </m:rPr>
-          <m:t>≤</m:t>
-        </m:r>
-        <m:r>
-          <m:t>U</m:t>
-        </m:r>
-        <m:r>
-          <m:rPr>
-            <m:sty m:val="p"/>
-          </m:rPr>
-          <m:t>)</m:t>
+        <m:sSub>
+          <m:e>
+            <m:r>
+              <m:rPr>
+                <m:sty m:val="p"/>
+              </m:rPr>
+              <m:t>Pr</m:t>
+            </m:r>
+          </m:e>
+          <m:sub>
+            <m:r>
+              <m:t>θ</m:t>
+            </m:r>
+          </m:sub>
+        </m:sSub>
+        <m:r>
+          <m:t>​</m:t>
+        </m:r>
+        <m:d>
+          <m:dPr>
+            <m:begChr m:val="("/>
+            <m:sepChr m:val=""/>
+            <m:endChr m:val=")"/>
+            <m:grow/>
+          </m:dPr>
+          <m:e>
+            <m:r>
+              <m:t>θ</m:t>
+            </m:r>
+            <m:r>
+              <m:rPr>
+                <m:sty m:val="p"/>
+              </m:rPr>
+              <m:t>∈</m:t>
+            </m:r>
+            <m:r>
+              <m:t>​</m:t>
+            </m:r>
+            <m:d>
+              <m:dPr>
+                <m:begChr m:val="["/>
+                <m:sepChr m:val=""/>
+                <m:endChr m:val="]"/>
+                <m:grow/>
+              </m:dPr>
+              <m:e>
+                <m:r>
+                  <m:t>L</m:t>
+                </m:r>
+                <m:r>
+                  <m:t>​</m:t>
+                </m:r>
+                <m:d>
+                  <m:dPr>
+                    <m:begChr m:val="("/>
+                    <m:sepChr m:val=""/>
+                    <m:endChr m:val=")"/>
+                    <m:grow/>
+                  </m:dPr>
+                  <m:e>
+                    <m:r>
+                      <m:t>X</m:t>
+                    </m:r>
+                  </m:e>
+                </m:d>
+                <m:r>
+                  <m:t>​</m:t>
+                </m:r>
+                <m:r>
+                  <m:rPr>
+                    <m:sty m:val="p"/>
+                  </m:rPr>
+                  <m:t>,</m:t>
+                </m:r>
+                <m:r>
+                  <m:t>U</m:t>
+                </m:r>
+                <m:r>
+                  <m:t>​</m:t>
+                </m:r>
+                <m:d>
+                  <m:dPr>
+                    <m:begChr m:val="("/>
+                    <m:sepChr m:val=""/>
+                    <m:endChr m:val=")"/>
+                    <m:grow/>
+                  </m:dPr>
+                  <m:e>
+                    <m:r>
+                      <m:t>X</m:t>
+                    </m:r>
+                  </m:e>
+                </m:d>
+                <m:r>
+                  <m:t>​</m:t>
+                </m:r>
+              </m:e>
+            </m:d>
+            <m:r>
+              <m:t>​</m:t>
+            </m:r>
+          </m:e>
+        </m:d>
+        <m:r>
+          <m:t>​</m:t>
         </m:r>
       </m:oMath>
       <w:r>
@@ -5813,7 +6161,7 @@
         <w:t xml:space="preserve"> </w:t>
       </w:r>
       <w:r>
-        <w:t xml:space="preserve">has coverage probability</w:t>
+        <w:t xml:space="preserve">has coverage probability at least</w:t>
       </w:r>
       <w:r>
         <w:t xml:space="preserve"> </w:t>
@@ -5833,6 +6181,20 @@
         </m:r>
       </m:oMath>
       <w:r>
+        <w:t xml:space="preserve"> </w:t>
+      </w:r>
+      <w:r>
+        <w:t xml:space="preserve">for every</w:t>
+      </w:r>
+      <w:r>
+        <w:t xml:space="preserve"> </w:t>
+      </w:r>
+      <m:oMath>
+        <m:r>
+          <m:t>θ</m:t>
+        </m:r>
+      </m:oMath>
+      <w:r>
         <w:t xml:space="preserve">.</w:t>
       </w:r>
     </w:p>
@@ -5847,14 +6209,14 @@
         <w:t xml:space="preserve"> </w:t>
       </w:r>
       <w:r>
-        <w:t xml:space="preserve">Wikipedia contributors [14]</w:t>
+        <w:t xml:space="preserve">[9], Definition 9.1.4</w:t>
       </w:r>
       <w:r>
         <w:t xml:space="preserve">.</w:t>
       </w:r>
     </w:p>
-    <w:bookmarkEnd w:id="38"/>
-    <w:bookmarkStart w:id="39" w:name="def-approximate-ci"/>
+    <w:bookmarkEnd w:id="40"/>
+    <w:bookmarkStart w:id="41" w:name="def-confidence-coefficient"/>
     <w:p>
       <w:pPr>
         <w:pStyle w:val="BodyText"/>
@@ -5864,13 +6226,13 @@
           <w:b/>
           <w:bCs/>
         </w:rPr>
-        <w:t xml:space="preserve">Definition 14 (Approximate confidence interval)</w:t>
-      </w:r>
-      <w:r>
-        <w:t xml:space="preserve"> </w:t>
-      </w:r>
-      <w:r>
-        <w:t xml:space="preserve">An</w:t>
+        <w:t xml:space="preserve">Definition 14 (Confidence coefficient)</w:t>
+      </w:r>
+      <w:r>
+        <w:t xml:space="preserve"> </w:t>
+      </w:r>
+      <w:r>
+        <w:t xml:space="preserve">The</w:t>
       </w:r>
       <w:r>
         <w:t xml:space="preserve"> </w:t>
@@ -5880,57 +6242,118 @@
           <w:b/>
           <w:bCs/>
         </w:rPr>
-        <w:t xml:space="preserve">approximate</w:t>
-      </w:r>
-      <w:r>
-        <w:t xml:space="preserve"> </w:t>
-      </w:r>
-      <m:oMath>
-        <m:r>
-          <m:t>100</m:t>
-        </m:r>
-        <m:r>
-          <m:rPr>
-            <m:sty m:val="p"/>
-          </m:rPr>
-          <m:t>(</m:t>
-        </m:r>
-        <m:r>
-          <m:t>1</m:t>
-        </m:r>
-        <m:r>
-          <m:rPr>
-            <m:sty m:val="p"/>
-          </m:rPr>
-          <m:t>−</m:t>
-        </m:r>
-        <m:r>
-          <m:t>α</m:t>
-        </m:r>
-        <m:r>
-          <m:rPr>
-            <m:sty m:val="p"/>
-          </m:rPr>
-          <m:t>)</m:t>
-        </m:r>
-        <m:r>
-          <m:rPr>
-            <m:sty m:val="p"/>
-          </m:rPr>
-          <m:t>%</m:t>
-        </m:r>
-      </m:oMath>
-      <w:r>
-        <w:t xml:space="preserve"> </w:t>
-      </w:r>
-      <w:r>
-        <w:t xml:space="preserve">confidence interval</w:t>
-      </w:r>
-      <w:r>
-        <w:t xml:space="preserve"> </w:t>
-      </w:r>
-      <w:r>
-        <w:t xml:space="preserve">is an interval whose</w:t>
+        <w:t xml:space="preserve">confidence coefficient</w:t>
+      </w:r>
+      <w:r>
+        <w:t xml:space="preserve"> </w:t>
+      </w:r>
+      <w:r>
+        <w:t xml:space="preserve">of an interval</w:t>
+      </w:r>
+      <w:r>
+        <w:t xml:space="preserve"> </w:t>
+      </w:r>
+      <m:oMath>
+        <m:r>
+          <m:t>​</m:t>
+        </m:r>
+        <m:d>
+          <m:dPr>
+            <m:begChr m:val="["/>
+            <m:sepChr m:val=""/>
+            <m:endChr m:val="]"/>
+            <m:grow/>
+          </m:dPr>
+          <m:e>
+            <m:r>
+              <m:t>L</m:t>
+            </m:r>
+            <m:r>
+              <m:t>​</m:t>
+            </m:r>
+            <m:d>
+              <m:dPr>
+                <m:begChr m:val="("/>
+                <m:sepChr m:val=""/>
+                <m:endChr m:val=")"/>
+                <m:grow/>
+              </m:dPr>
+              <m:e>
+                <m:r>
+                  <m:t>X</m:t>
+                </m:r>
+              </m:e>
+            </m:d>
+            <m:r>
+              <m:t>​</m:t>
+            </m:r>
+            <m:r>
+              <m:rPr>
+                <m:sty m:val="p"/>
+              </m:rPr>
+              <m:t>,</m:t>
+            </m:r>
+            <m:r>
+              <m:t>U</m:t>
+            </m:r>
+            <m:r>
+              <m:t>​</m:t>
+            </m:r>
+            <m:d>
+              <m:dPr>
+                <m:begChr m:val="("/>
+                <m:sepChr m:val=""/>
+                <m:endChr m:val=")"/>
+                <m:grow/>
+              </m:dPr>
+              <m:e>
+                <m:r>
+                  <m:t>X</m:t>
+                </m:r>
+              </m:e>
+            </m:d>
+            <m:r>
+              <m:t>​</m:t>
+            </m:r>
+          </m:e>
+        </m:d>
+        <m:r>
+          <m:t>​</m:t>
+        </m:r>
+      </m:oMath>
+      <w:r>
+        <w:t xml:space="preserve"> </w:t>
+      </w:r>
+      <w:r>
+        <w:t xml:space="preserve">for a parameter</w:t>
+      </w:r>
+      <w:r>
+        <w:t xml:space="preserve"> </w:t>
+      </w:r>
+      <m:oMath>
+        <m:r>
+          <m:t>θ</m:t>
+        </m:r>
+      </m:oMath>
+      <w:r>
+        <w:t xml:space="preserve"> </w:t>
+      </w:r>
+      <w:r>
+        <w:t xml:space="preserve">is the infimum over</w:t>
+      </w:r>
+      <w:r>
+        <w:t xml:space="preserve"> </w:t>
+      </w:r>
+      <m:oMath>
+        <m:r>
+          <m:t>θ</m:t>
+        </m:r>
+      </m:oMath>
+      <w:r>
+        <w:t xml:space="preserve"> </w:t>
+      </w:r>
+      <w:r>
+        <w:t xml:space="preserve">of its</w:t>
       </w:r>
       <w:r>
         <w:t xml:space="preserve"> </w:t>
@@ -5944,15 +6367,187 @@
         </w:r>
       </w:hyperlink>
       <w:r>
-        <w:t xml:space="preserve"> </w:t>
-      </w:r>
-      <w:r>
-        <w:t xml:space="preserve">is approximately</w:t>
-      </w:r>
-      <w:r>
-        <w:t xml:space="preserve"> </w:t>
-      </w:r>
-      <m:oMath>
+        <w:t xml:space="preserve">,</w:t>
+      </w:r>
+      <w:r>
+        <w:t xml:space="preserve"> </w:t>
+      </w:r>
+      <m:oMath>
+        <m:sSub>
+          <m:e>
+            <m:r>
+              <m:rPr>
+                <m:sty m:val="p"/>
+              </m:rPr>
+              <m:t>inf</m:t>
+            </m:r>
+          </m:e>
+          <m:sub>
+            <m:r>
+              <m:t>θ</m:t>
+            </m:r>
+          </m:sub>
+        </m:sSub>
+        <m:sSub>
+          <m:e>
+            <m:r>
+              <m:rPr>
+                <m:sty m:val="p"/>
+              </m:rPr>
+              <m:t>Pr</m:t>
+            </m:r>
+          </m:e>
+          <m:sub>
+            <m:r>
+              <m:t>θ</m:t>
+            </m:r>
+          </m:sub>
+        </m:sSub>
+        <m:r>
+          <m:t>​</m:t>
+        </m:r>
+        <m:d>
+          <m:dPr>
+            <m:begChr m:val="("/>
+            <m:sepChr m:val=""/>
+            <m:endChr m:val=")"/>
+            <m:grow/>
+          </m:dPr>
+          <m:e>
+            <m:r>
+              <m:t>θ</m:t>
+            </m:r>
+            <m:r>
+              <m:rPr>
+                <m:sty m:val="p"/>
+              </m:rPr>
+              <m:t>∈</m:t>
+            </m:r>
+            <m:r>
+              <m:t>​</m:t>
+            </m:r>
+            <m:d>
+              <m:dPr>
+                <m:begChr m:val="["/>
+                <m:sepChr m:val=""/>
+                <m:endChr m:val="]"/>
+                <m:grow/>
+              </m:dPr>
+              <m:e>
+                <m:r>
+                  <m:t>L</m:t>
+                </m:r>
+                <m:r>
+                  <m:t>​</m:t>
+                </m:r>
+                <m:d>
+                  <m:dPr>
+                    <m:begChr m:val="("/>
+                    <m:sepChr m:val=""/>
+                    <m:endChr m:val=")"/>
+                    <m:grow/>
+                  </m:dPr>
+                  <m:e>
+                    <m:r>
+                      <m:t>X</m:t>
+                    </m:r>
+                  </m:e>
+                </m:d>
+                <m:r>
+                  <m:t>​</m:t>
+                </m:r>
+                <m:r>
+                  <m:rPr>
+                    <m:sty m:val="p"/>
+                  </m:rPr>
+                  <m:t>,</m:t>
+                </m:r>
+                <m:r>
+                  <m:t>U</m:t>
+                </m:r>
+                <m:r>
+                  <m:t>​</m:t>
+                </m:r>
+                <m:d>
+                  <m:dPr>
+                    <m:begChr m:val="("/>
+                    <m:sepChr m:val=""/>
+                    <m:endChr m:val=")"/>
+                    <m:grow/>
+                  </m:dPr>
+                  <m:e>
+                    <m:r>
+                      <m:t>X</m:t>
+                    </m:r>
+                  </m:e>
+                </m:d>
+                <m:r>
+                  <m:t>​</m:t>
+                </m:r>
+              </m:e>
+            </m:d>
+            <m:r>
+              <m:t>​</m:t>
+            </m:r>
+          </m:e>
+        </m:d>
+        <m:r>
+          <m:t>​</m:t>
+        </m:r>
+      </m:oMath>
+      <w:r>
+        <w:t xml:space="preserve">.</w:t>
+      </w:r>
+    </w:p>
+    <w:p>
+      <w:pPr>
+        <w:pStyle w:val="BodyText"/>
+      </w:pPr>
+      <w:r>
+        <w:t xml:space="preserve">Source:</w:t>
+      </w:r>
+      <w:r>
+        <w:t xml:space="preserve"> </w:t>
+      </w:r>
+      <w:r>
+        <w:t xml:space="preserve">[9], Definition 9.1.5</w:t>
+      </w:r>
+      <w:r>
+        <w:t xml:space="preserve">.</w:t>
+      </w:r>
+    </w:p>
+    <w:bookmarkEnd w:id="41"/>
+    <w:bookmarkStart w:id="42" w:name="def-exact-confidence-interval"/>
+    <w:p>
+      <w:pPr>
+        <w:pStyle w:val="BodyText"/>
+      </w:pPr>
+      <w:r>
+        <w:rPr>
+          <w:b/>
+          <w:bCs/>
+        </w:rPr>
+        <w:t xml:space="preserve">Definition 15 (Exact confidence interval)</w:t>
+      </w:r>
+      <w:r>
+        <w:t xml:space="preserve"> </w:t>
+      </w:r>
+      <w:r>
+        <w:t xml:space="preserve">A</w:t>
+      </w:r>
+      <w:r>
+        <w:t xml:space="preserve"> </w:t>
+      </w:r>
+      <m:oMath>
+        <m:r>
+          <m:t>100</m:t>
+        </m:r>
+        <m:r>
+          <m:rPr>
+            <m:sty m:val="p"/>
+          </m:rPr>
+          <m:t>(</m:t>
+        </m:r>
         <m:r>
           <m:t>1</m:t>
         </m:r>
@@ -5965,29 +6560,2090 @@
         <m:r>
           <m:t>α</m:t>
         </m:r>
-      </m:oMath>
-      <w:r>
-        <w:t xml:space="preserve">,</w:t>
-      </w:r>
-      <w:r>
-        <w:t xml:space="preserve"> </w:t>
-      </w:r>
-      <w:r>
-        <w:t xml:space="preserve">for example only in large samples.</w:t>
-      </w:r>
-    </w:p>
-    <w:bookmarkEnd w:id="39"/>
-    <w:bookmarkStart w:id="41" w:name="exm-confidence-interval-wcgs"/>
-    <w:p>
-      <w:pPr>
-        <w:pStyle w:val="BodyText"/>
-      </w:pPr>
+        <m:r>
+          <m:rPr>
+            <m:sty m:val="p"/>
+          </m:rPr>
+          <m:t>)</m:t>
+        </m:r>
+        <m:r>
+          <m:rPr>
+            <m:sty m:val="p"/>
+          </m:rPr>
+          <m:t>%</m:t>
+        </m:r>
+      </m:oMath>
+      <w:r>
+        <w:t xml:space="preserve"> </w:t>
+      </w:r>
+      <w:hyperlink w:anchor="def-confidence-interval">
+        <w:r>
+          <w:rPr>
+            <w:rStyle w:val="Hyperlink"/>
+          </w:rPr>
+          <w:t xml:space="preserve">confidence interval</w:t>
+        </w:r>
+      </w:hyperlink>
+      <w:r>
+        <w:t xml:space="preserve"> </w:t>
+      </w:r>
+      <m:oMath>
+        <m:r>
+          <m:t>​</m:t>
+        </m:r>
+        <m:d>
+          <m:dPr>
+            <m:begChr m:val="["/>
+            <m:sepChr m:val=""/>
+            <m:endChr m:val="]"/>
+            <m:grow/>
+          </m:dPr>
+          <m:e>
+            <m:r>
+              <m:t>L</m:t>
+            </m:r>
+            <m:r>
+              <m:t>​</m:t>
+            </m:r>
+            <m:d>
+              <m:dPr>
+                <m:begChr m:val="("/>
+                <m:sepChr m:val=""/>
+                <m:endChr m:val=")"/>
+                <m:grow/>
+              </m:dPr>
+              <m:e>
+                <m:r>
+                  <m:t>X</m:t>
+                </m:r>
+              </m:e>
+            </m:d>
+            <m:r>
+              <m:t>​</m:t>
+            </m:r>
+            <m:r>
+              <m:rPr>
+                <m:sty m:val="p"/>
+              </m:rPr>
+              <m:t>,</m:t>
+            </m:r>
+            <m:r>
+              <m:t>U</m:t>
+            </m:r>
+            <m:r>
+              <m:t>​</m:t>
+            </m:r>
+            <m:d>
+              <m:dPr>
+                <m:begChr m:val="("/>
+                <m:sepChr m:val=""/>
+                <m:endChr m:val=")"/>
+                <m:grow/>
+              </m:dPr>
+              <m:e>
+                <m:r>
+                  <m:t>X</m:t>
+                </m:r>
+              </m:e>
+            </m:d>
+            <m:r>
+              <m:t>​</m:t>
+            </m:r>
+          </m:e>
+        </m:d>
+        <m:r>
+          <m:t>​</m:t>
+        </m:r>
+      </m:oMath>
+      <w:r>
+        <w:t xml:space="preserve"> </w:t>
+      </w:r>
+      <w:r>
+        <w:t xml:space="preserve">is</w:t>
+      </w:r>
+      <w:r>
+        <w:t xml:space="preserve"> </w:t>
+      </w:r>
       <w:r>
         <w:rPr>
           <w:b/>
           <w:bCs/>
         </w:rPr>
-        <w:t xml:space="preserve">Example 7 (Confidence interval for population mean cholesterol in the WCGS)</w:t>
+        <w:t xml:space="preserve">exact</w:t>
+      </w:r>
+      <w:r>
+        <w:t xml:space="preserve"> </w:t>
+      </w:r>
+      <w:r>
+        <w:t xml:space="preserve">when its</w:t>
+      </w:r>
+      <w:r>
+        <w:t xml:space="preserve"> </w:t>
+      </w:r>
+      <w:hyperlink w:anchor="def-coverage-probability">
+        <w:r>
+          <w:rPr>
+            <w:rStyle w:val="Hyperlink"/>
+          </w:rPr>
+          <w:t xml:space="preserve">coverage probability</w:t>
+        </w:r>
+      </w:hyperlink>
+      <w:r>
+        <w:t xml:space="preserve"> </w:t>
+      </w:r>
+      <w:r>
+        <w:t xml:space="preserve">equals</w:t>
+      </w:r>
+      <w:r>
+        <w:t xml:space="preserve"> </w:t>
+      </w:r>
+      <m:oMath>
+        <m:r>
+          <m:t>1</m:t>
+        </m:r>
+        <m:r>
+          <m:rPr>
+            <m:sty m:val="p"/>
+          </m:rPr>
+          <m:t>−</m:t>
+        </m:r>
+        <m:r>
+          <m:t>α</m:t>
+        </m:r>
+      </m:oMath>
+      <w:r>
+        <w:t xml:space="preserve"> </w:t>
+      </w:r>
+      <w:r>
+        <w:t xml:space="preserve">for every possible value of</w:t>
+      </w:r>
+      <w:r>
+        <w:t xml:space="preserve"> </w:t>
+      </w:r>
+      <m:oMath>
+        <m:r>
+          <m:t>θ</m:t>
+        </m:r>
+      </m:oMath>
+      <w:r>
+        <w:t xml:space="preserve">.</w:t>
+      </w:r>
+    </w:p>
+    <w:bookmarkEnd w:id="42"/>
+    <w:bookmarkStart w:id="43" w:name="def-conservative-confidence-interval"/>
+    <w:p>
+      <w:pPr>
+        <w:pStyle w:val="BodyText"/>
+      </w:pPr>
+      <w:r>
+        <w:rPr>
+          <w:b/>
+          <w:bCs/>
+        </w:rPr>
+        <w:t xml:space="preserve">Definition 16 (Conservative confidence interval)</w:t>
+      </w:r>
+      <w:r>
+        <w:t xml:space="preserve"> </w:t>
+      </w:r>
+      <w:r>
+        <w:t xml:space="preserve">A</w:t>
+      </w:r>
+      <w:r>
+        <w:t xml:space="preserve"> </w:t>
+      </w:r>
+      <m:oMath>
+        <m:r>
+          <m:t>100</m:t>
+        </m:r>
+        <m:r>
+          <m:rPr>
+            <m:sty m:val="p"/>
+          </m:rPr>
+          <m:t>(</m:t>
+        </m:r>
+        <m:r>
+          <m:t>1</m:t>
+        </m:r>
+        <m:r>
+          <m:rPr>
+            <m:sty m:val="p"/>
+          </m:rPr>
+          <m:t>−</m:t>
+        </m:r>
+        <m:r>
+          <m:t>α</m:t>
+        </m:r>
+        <m:r>
+          <m:rPr>
+            <m:sty m:val="p"/>
+          </m:rPr>
+          <m:t>)</m:t>
+        </m:r>
+        <m:r>
+          <m:rPr>
+            <m:sty m:val="p"/>
+          </m:rPr>
+          <m:t>%</m:t>
+        </m:r>
+      </m:oMath>
+      <w:r>
+        <w:t xml:space="preserve"> </w:t>
+      </w:r>
+      <w:hyperlink w:anchor="def-confidence-interval">
+        <w:r>
+          <w:rPr>
+            <w:rStyle w:val="Hyperlink"/>
+          </w:rPr>
+          <w:t xml:space="preserve">confidence interval</w:t>
+        </w:r>
+      </w:hyperlink>
+      <w:r>
+        <w:t xml:space="preserve"> </w:t>
+      </w:r>
+      <m:oMath>
+        <m:r>
+          <m:t>​</m:t>
+        </m:r>
+        <m:d>
+          <m:dPr>
+            <m:begChr m:val="["/>
+            <m:sepChr m:val=""/>
+            <m:endChr m:val="]"/>
+            <m:grow/>
+          </m:dPr>
+          <m:e>
+            <m:r>
+              <m:t>L</m:t>
+            </m:r>
+            <m:r>
+              <m:t>​</m:t>
+            </m:r>
+            <m:d>
+              <m:dPr>
+                <m:begChr m:val="("/>
+                <m:sepChr m:val=""/>
+                <m:endChr m:val=")"/>
+                <m:grow/>
+              </m:dPr>
+              <m:e>
+                <m:r>
+                  <m:t>X</m:t>
+                </m:r>
+              </m:e>
+            </m:d>
+            <m:r>
+              <m:t>​</m:t>
+            </m:r>
+            <m:r>
+              <m:rPr>
+                <m:sty m:val="p"/>
+              </m:rPr>
+              <m:t>,</m:t>
+            </m:r>
+            <m:r>
+              <m:t>U</m:t>
+            </m:r>
+            <m:r>
+              <m:t>​</m:t>
+            </m:r>
+            <m:d>
+              <m:dPr>
+                <m:begChr m:val="("/>
+                <m:sepChr m:val=""/>
+                <m:endChr m:val=")"/>
+                <m:grow/>
+              </m:dPr>
+              <m:e>
+                <m:r>
+                  <m:t>X</m:t>
+                </m:r>
+              </m:e>
+            </m:d>
+            <m:r>
+              <m:t>​</m:t>
+            </m:r>
+          </m:e>
+        </m:d>
+        <m:r>
+          <m:t>​</m:t>
+        </m:r>
+      </m:oMath>
+      <w:r>
+        <w:t xml:space="preserve"> </w:t>
+      </w:r>
+      <w:r>
+        <w:t xml:space="preserve">is</w:t>
+      </w:r>
+      <w:r>
+        <w:t xml:space="preserve"> </w:t>
+      </w:r>
+      <w:r>
+        <w:rPr>
+          <w:b/>
+          <w:bCs/>
+        </w:rPr>
+        <w:t xml:space="preserve">conservative</w:t>
+      </w:r>
+      <w:r>
+        <w:t xml:space="preserve"> </w:t>
+      </w:r>
+      <w:r>
+        <w:t xml:space="preserve">when its</w:t>
+      </w:r>
+      <w:r>
+        <w:t xml:space="preserve"> </w:t>
+      </w:r>
+      <w:hyperlink w:anchor="def-coverage-probability">
+        <w:r>
+          <w:rPr>
+            <w:rStyle w:val="Hyperlink"/>
+          </w:rPr>
+          <w:t xml:space="preserve">coverage probability</w:t>
+        </w:r>
+      </w:hyperlink>
+      <w:r>
+        <w:t xml:space="preserve"> </w:t>
+      </w:r>
+      <w:r>
+        <w:t xml:space="preserve">is at least</w:t>
+      </w:r>
+      <w:r>
+        <w:t xml:space="preserve"> </w:t>
+      </w:r>
+      <m:oMath>
+        <m:r>
+          <m:t>1</m:t>
+        </m:r>
+        <m:r>
+          <m:rPr>
+            <m:sty m:val="p"/>
+          </m:rPr>
+          <m:t>−</m:t>
+        </m:r>
+        <m:r>
+          <m:t>α</m:t>
+        </m:r>
+      </m:oMath>
+      <w:r>
+        <w:t xml:space="preserve"> </w:t>
+      </w:r>
+      <w:r>
+        <w:t xml:space="preserve">for every possible value of</w:t>
+      </w:r>
+      <w:r>
+        <w:t xml:space="preserve"> </w:t>
+      </w:r>
+      <m:oMath>
+        <m:r>
+          <m:t>θ</m:t>
+        </m:r>
+      </m:oMath>
+      <w:r>
+        <w:t xml:space="preserve"> </w:t>
+      </w:r>
+      <w:r>
+        <w:t xml:space="preserve">and larger than</w:t>
+      </w:r>
+      <w:r>
+        <w:t xml:space="preserve"> </w:t>
+      </w:r>
+      <m:oMath>
+        <m:r>
+          <m:t>1</m:t>
+        </m:r>
+        <m:r>
+          <m:rPr>
+            <m:sty m:val="p"/>
+          </m:rPr>
+          <m:t>−</m:t>
+        </m:r>
+        <m:r>
+          <m:t>α</m:t>
+        </m:r>
+      </m:oMath>
+      <w:r>
+        <w:t xml:space="preserve"> </w:t>
+      </w:r>
+      <w:r>
+        <w:t xml:space="preserve">for some possible value of</w:t>
+      </w:r>
+      <w:r>
+        <w:t xml:space="preserve"> </w:t>
+      </w:r>
+      <m:oMath>
+        <m:r>
+          <m:t>θ</m:t>
+        </m:r>
+      </m:oMath>
+      <w:r>
+        <w:t xml:space="preserve">.</w:t>
+      </w:r>
+    </w:p>
+    <w:bookmarkEnd w:id="43"/>
+    <w:bookmarkStart w:id="45" w:name="def-confidence-set"/>
+    <w:p>
+      <w:pPr>
+        <w:pStyle w:val="BodyText"/>
+      </w:pPr>
+      <w:r>
+        <w:rPr>
+          <w:b/>
+          <w:bCs/>
+        </w:rPr>
+        <w:t xml:space="preserve">Definition 17 (Confidence set)</w:t>
+      </w:r>
+      <w:r>
+        <w:t xml:space="preserve"> </w:t>
+      </w:r>
+      <w:r>
+        <w:t xml:space="preserve">A</w:t>
+      </w:r>
+      <w:r>
+        <w:t xml:space="preserve"> </w:t>
+      </w:r>
+      <m:oMath>
+        <m:r>
+          <m:t>100</m:t>
+        </m:r>
+        <m:r>
+          <m:rPr>
+            <m:sty m:val="p"/>
+          </m:rPr>
+          <m:t>(</m:t>
+        </m:r>
+        <m:r>
+          <m:t>1</m:t>
+        </m:r>
+        <m:r>
+          <m:rPr>
+            <m:sty m:val="p"/>
+          </m:rPr>
+          <m:t>−</m:t>
+        </m:r>
+        <m:r>
+          <m:t>α</m:t>
+        </m:r>
+        <m:r>
+          <m:rPr>
+            <m:sty m:val="p"/>
+          </m:rPr>
+          <m:t>)</m:t>
+        </m:r>
+        <m:r>
+          <m:rPr>
+            <m:sty m:val="p"/>
+          </m:rPr>
+          <m:t>%</m:t>
+        </m:r>
+      </m:oMath>
+      <w:r>
+        <w:t xml:space="preserve"> </w:t>
+      </w:r>
+      <w:r>
+        <w:rPr>
+          <w:b/>
+          <w:bCs/>
+        </w:rPr>
+        <w:t xml:space="preserve">confidence set</w:t>
+      </w:r>
+      <w:r>
+        <w:t xml:space="preserve"> </w:t>
+      </w:r>
+      <w:r>
+        <w:t xml:space="preserve">for a parameter</w:t>
+      </w:r>
+      <w:r>
+        <w:t xml:space="preserve"> </w:t>
+      </w:r>
+      <m:oMath>
+        <m:r>
+          <m:t>θ</m:t>
+        </m:r>
+      </m:oMath>
+      <w:r>
+        <w:t xml:space="preserve"> </w:t>
+      </w:r>
+      <w:r>
+        <w:t xml:space="preserve">is a random subset</w:t>
+      </w:r>
+      <w:r>
+        <w:t xml:space="preserve"> </w:t>
+      </w:r>
+      <m:oMath>
+        <m:r>
+          <m:t>C</m:t>
+        </m:r>
+        <m:r>
+          <m:rPr>
+            <m:sty m:val="p"/>
+          </m:rPr>
+          <m:t>(</m:t>
+        </m:r>
+        <m:r>
+          <m:t>X</m:t>
+        </m:r>
+        <m:r>
+          <m:rPr>
+            <m:sty m:val="p"/>
+          </m:rPr>
+          <m:t>)</m:t>
+        </m:r>
+      </m:oMath>
+      <w:r>
+        <w:t xml:space="preserve"> </w:t>
+      </w:r>
+      <w:r>
+        <w:t xml:space="preserve">of the</w:t>
+      </w:r>
+      <w:r>
+        <w:t xml:space="preserve"> </w:t>
+      </w:r>
+      <w:hyperlink r:id="rId44">
+        <w:r>
+          <w:rPr>
+            <w:rStyle w:val="Hyperlink"/>
+          </w:rPr>
+          <w:t xml:space="preserve">parameter space</w:t>
+        </w:r>
+      </w:hyperlink>
+      <w:r>
+        <w:t xml:space="preserve">,</w:t>
+      </w:r>
+      <w:r>
+        <w:t xml:space="preserve"> </w:t>
+      </w:r>
+      <w:r>
+        <w:t xml:space="preserve">computed from the data</w:t>
+      </w:r>
+      <w:r>
+        <w:t xml:space="preserve"> </w:t>
+      </w:r>
+      <m:oMath>
+        <m:r>
+          <m:t>X</m:t>
+        </m:r>
+      </m:oMath>
+      <w:r>
+        <w:t xml:space="preserve">,</w:t>
+      </w:r>
+      <w:r>
+        <w:t xml:space="preserve"> </w:t>
+      </w:r>
+      <w:r>
+        <w:t xml:space="preserve">such that for every possible value of</w:t>
+      </w:r>
+      <w:r>
+        <w:t xml:space="preserve"> </w:t>
+      </w:r>
+      <m:oMath>
+        <m:r>
+          <m:t>θ</m:t>
+        </m:r>
+      </m:oMath>
+      <w:r>
+        <w:t xml:space="preserve">:</w:t>
+      </w:r>
+    </w:p>
+    <w:p>
+      <w:pPr>
+        <w:pStyle w:val="BodyText"/>
+      </w:pPr>
+      <m:oMathPara>
+        <m:oMathParaPr>
+          <m:jc m:val="center"/>
+        </m:oMathParaPr>
+        <m:oMath>
+          <m:limLow>
+            <m:e>
+              <m:r>
+                <m:rPr>
+                  <m:sty m:val="p"/>
+                </m:rPr>
+                <m:t>Pr</m:t>
+              </m:r>
+            </m:e>
+            <m:lim>
+              <m:r>
+                <m:t>θ</m:t>
+              </m:r>
+            </m:lim>
+          </m:limLow>
+          <m:r>
+            <m:t>​</m:t>
+          </m:r>
+          <m:d>
+            <m:dPr>
+              <m:begChr m:val="("/>
+              <m:sepChr m:val=""/>
+              <m:endChr m:val=")"/>
+              <m:grow/>
+            </m:dPr>
+            <m:e>
+              <m:r>
+                <m:t>θ</m:t>
+              </m:r>
+              <m:r>
+                <m:rPr>
+                  <m:sty m:val="p"/>
+                </m:rPr>
+                <m:t>∈</m:t>
+              </m:r>
+              <m:r>
+                <m:t>C</m:t>
+              </m:r>
+              <m:r>
+                <m:rPr>
+                  <m:sty m:val="p"/>
+                </m:rPr>
+                <m:t>(</m:t>
+              </m:r>
+              <m:r>
+                <m:t>X</m:t>
+              </m:r>
+              <m:r>
+                <m:rPr>
+                  <m:sty m:val="p"/>
+                </m:rPr>
+                <m:t>)</m:t>
+              </m:r>
+            </m:e>
+          </m:d>
+          <m:r>
+            <m:t>​</m:t>
+          </m:r>
+          <m:r>
+            <m:rPr>
+              <m:sty m:val="p"/>
+            </m:rPr>
+            <m:t>≥</m:t>
+          </m:r>
+          <m:r>
+            <m:t>1</m:t>
+          </m:r>
+          <m:r>
+            <m:rPr>
+              <m:sty m:val="p"/>
+            </m:rPr>
+            <m:t>−</m:t>
+          </m:r>
+          <m:r>
+            <m:t>α</m:t>
+          </m:r>
+        </m:oMath>
+      </m:oMathPara>
+    </w:p>
+    <w:p>
+      <w:pPr>
+        <w:pStyle w:val="FirstParagraph"/>
+      </w:pPr>
+      <w:r>
+        <w:t xml:space="preserve">A</w:t>
+      </w:r>
+      <w:r>
+        <w:t xml:space="preserve"> </w:t>
+      </w:r>
+      <w:hyperlink w:anchor="def-confidence-interval">
+        <w:r>
+          <w:rPr>
+            <w:rStyle w:val="Hyperlink"/>
+          </w:rPr>
+          <w:t xml:space="preserve">confidence interval</w:t>
+        </w:r>
+      </w:hyperlink>
+      <w:r>
+        <w:t xml:space="preserve"> </w:t>
+      </w:r>
+      <w:r>
+        <w:t xml:space="preserve">is a confidence set</w:t>
+      </w:r>
+      <w:r>
+        <w:t xml:space="preserve"> </w:t>
+      </w:r>
+      <w:r>
+        <w:t xml:space="preserve">whose values are</w:t>
+      </w:r>
+      <w:r>
+        <w:t xml:space="preserve"> </w:t>
+      </w:r>
+      <w:hyperlink r:id="rId37">
+        <w:r>
+          <w:rPr>
+            <w:rStyle w:val="Hyperlink"/>
+          </w:rPr>
+          <w:t xml:space="preserve">closed intervals</w:t>
+        </w:r>
+      </w:hyperlink>
+      <w:r>
+        <w:t xml:space="preserve">.</w:t>
+      </w:r>
+    </w:p>
+    <w:p>
+      <w:pPr>
+        <w:pStyle w:val="BodyText"/>
+      </w:pPr>
+      <w:r>
+        <w:t xml:space="preserve">Source:</w:t>
+      </w:r>
+      <w:r>
+        <w:t xml:space="preserve"> </w:t>
+      </w:r>
+      <w:r>
+        <w:t xml:space="preserve">[9, Sec. 9.1]</w:t>
+      </w:r>
+      <w:r>
+        <w:t xml:space="preserve">.</w:t>
+      </w:r>
+    </w:p>
+    <w:bookmarkEnd w:id="45"/>
+    <w:bookmarkStart w:id="48" w:name="exm-conservative-interval"/>
+    <w:p>
+      <w:pPr>
+        <w:pStyle w:val="BodyText"/>
+      </w:pPr>
+      <w:r>
+        <w:rPr>
+          <w:b/>
+          <w:bCs/>
+        </w:rPr>
+        <w:t xml:space="preserve">Example 7 (A conservative interval for a binomial proportion)</w:t>
+      </w:r>
+      <w:r>
+        <w:t xml:space="preserve"> </w:t>
+      </w:r>
+      <w:r>
+        <w:t xml:space="preserve">Let</w:t>
+      </w:r>
+      <w:r>
+        <w:t xml:space="preserve"> </w:t>
+      </w:r>
+      <m:oMath>
+        <m:r>
+          <m:t>X</m:t>
+        </m:r>
+        <m:r>
+          <m:rPr>
+            <m:sty m:val="p"/>
+          </m:rPr>
+          <m:t>∼</m:t>
+        </m:r>
+        <m:r>
+          <m:rPr>
+            <m:nor/>
+            <m:sty m:val="p"/>
+          </m:rPr>
+          <m:t>Bin</m:t>
+        </m:r>
+        <m:r>
+          <m:rPr>
+            <m:sty m:val="p"/>
+          </m:rPr>
+          <m:t>(</m:t>
+        </m:r>
+        <m:r>
+          <m:t>n</m:t>
+        </m:r>
+        <m:r>
+          <m:rPr>
+            <m:sty m:val="p"/>
+          </m:rPr>
+          <m:t>,</m:t>
+        </m:r>
+        <m:r>
+          <m:t>p</m:t>
+        </m:r>
+        <m:r>
+          <m:rPr>
+            <m:sty m:val="p"/>
+          </m:rPr>
+          <m:t>)</m:t>
+        </m:r>
+      </m:oMath>
+      <w:r>
+        <w:t xml:space="preserve"> </w:t>
+      </w:r>
+      <w:r>
+        <w:t xml:space="preserve">with</w:t>
+      </w:r>
+      <w:r>
+        <w:t xml:space="preserve"> </w:t>
+      </w:r>
+      <m:oMath>
+        <m:r>
+          <m:t>n</m:t>
+        </m:r>
+        <m:r>
+          <m:rPr>
+            <m:sty m:val="p"/>
+          </m:rPr>
+          <m:t>=</m:t>
+        </m:r>
+        <m:r>
+          <m:t>20</m:t>
+        </m:r>
+      </m:oMath>
+      <w:r>
+        <w:t xml:space="preserve">,</w:t>
+      </w:r>
+      <w:r>
+        <w:t xml:space="preserve"> </w:t>
+      </w:r>
+      <w:r>
+        <w:t xml:space="preserve">and let</w:t>
+      </w:r>
+      <w:r>
+        <w:t xml:space="preserve"> </w:t>
+      </w:r>
+      <m:oMath>
+        <m:r>
+          <m:t>​</m:t>
+        </m:r>
+        <m:d>
+          <m:dPr>
+            <m:begChr m:val="["/>
+            <m:sepChr m:val=""/>
+            <m:endChr m:val="]"/>
+            <m:grow/>
+          </m:dPr>
+          <m:e>
+            <m:r>
+              <m:t>L</m:t>
+            </m:r>
+            <m:r>
+              <m:t>​</m:t>
+            </m:r>
+            <m:d>
+              <m:dPr>
+                <m:begChr m:val="("/>
+                <m:sepChr m:val=""/>
+                <m:endChr m:val=")"/>
+                <m:grow/>
+              </m:dPr>
+              <m:e>
+                <m:r>
+                  <m:t>X</m:t>
+                </m:r>
+              </m:e>
+            </m:d>
+            <m:r>
+              <m:t>​</m:t>
+            </m:r>
+            <m:r>
+              <m:rPr>
+                <m:sty m:val="p"/>
+              </m:rPr>
+              <m:t>,</m:t>
+            </m:r>
+            <m:r>
+              <m:t>U</m:t>
+            </m:r>
+            <m:r>
+              <m:t>​</m:t>
+            </m:r>
+            <m:d>
+              <m:dPr>
+                <m:begChr m:val="("/>
+                <m:sepChr m:val=""/>
+                <m:endChr m:val=")"/>
+                <m:grow/>
+              </m:dPr>
+              <m:e>
+                <m:r>
+                  <m:t>X</m:t>
+                </m:r>
+              </m:e>
+            </m:d>
+            <m:r>
+              <m:t>​</m:t>
+            </m:r>
+          </m:e>
+        </m:d>
+        <m:r>
+          <m:t>​</m:t>
+        </m:r>
+      </m:oMath>
+      <w:r>
+        <w:t xml:space="preserve"> </w:t>
+      </w:r>
+      <w:r>
+        <w:t xml:space="preserve">be the Clopper-Pearson 95% interval</w:t>
+      </w:r>
+      <w:r>
+        <w:t xml:space="preserve"> </w:t>
+      </w:r>
+      <w:r>
+        <w:t xml:space="preserve">returned by</w:t>
+      </w:r>
+      <w:r>
+        <w:t xml:space="preserve"> </w:t>
+      </w:r>
+      <w:r>
+        <w:rPr>
+          <w:rStyle w:val="VerbatimChar"/>
+        </w:rPr>
+        <w:t xml:space="preserve">binom.test()</w:t>
+      </w:r>
+      <w:r>
+        <w:t xml:space="preserve">.</w:t>
+      </w:r>
+      <w:r>
+        <w:t xml:space="preserve"> </w:t>
+      </w:r>
+      <w:r>
+        <w:t xml:space="preserve">Its</w:t>
+      </w:r>
+      <w:r>
+        <w:t xml:space="preserve"> </w:t>
+      </w:r>
+      <w:hyperlink w:anchor="def-coverage-probability">
+        <w:r>
+          <w:rPr>
+            <w:rStyle w:val="Hyperlink"/>
+          </w:rPr>
+          <w:t xml:space="preserve">coverage probability</w:t>
+        </w:r>
+      </w:hyperlink>
+      <w:r>
+        <w:t xml:space="preserve"> </w:t>
+      </w:r>
+      <w:r>
+        <w:t xml:space="preserve">at each</w:t>
+      </w:r>
+      <w:r>
+        <w:t xml:space="preserve"> </w:t>
+      </w:r>
+      <m:oMath>
+        <m:r>
+          <m:t>p</m:t>
+        </m:r>
+      </m:oMath>
+      <w:r>
+        <w:t xml:space="preserve"> </w:t>
+      </w:r>
+      <w:r>
+        <w:t xml:space="preserve">is the sum of the binomial</w:t>
+      </w:r>
+      <w:r>
+        <w:t xml:space="preserve"> </w:t>
+      </w:r>
+      <w:hyperlink r:id="rId46">
+        <w:r>
+          <w:rPr>
+            <w:rStyle w:val="Hyperlink"/>
+          </w:rPr>
+          <w:t xml:space="preserve">probabilities</w:t>
+        </w:r>
+      </w:hyperlink>
+      <w:r>
+        <w:t xml:space="preserve"> </w:t>
+      </w:r>
+      <w:r>
+        <w:t xml:space="preserve">of the values</w:t>
+      </w:r>
+      <w:r>
+        <w:t xml:space="preserve"> </w:t>
+      </w:r>
+      <m:oMath>
+        <m:r>
+          <m:t>x</m:t>
+        </m:r>
+      </m:oMath>
+      <w:r>
+        <w:t xml:space="preserve"> </w:t>
+      </w:r>
+      <w:r>
+        <w:t xml:space="preserve">of</w:t>
+      </w:r>
+      <w:r>
+        <w:t xml:space="preserve"> </w:t>
+      </w:r>
+      <m:oMath>
+        <m:r>
+          <m:t>X</m:t>
+        </m:r>
+      </m:oMath>
+      <w:r>
+        <w:t xml:space="preserve"> </w:t>
+      </w:r>
+      <w:r>
+        <w:t xml:space="preserve">for which</w:t>
+      </w:r>
+      <w:r>
+        <w:t xml:space="preserve"> </w:t>
+      </w:r>
+      <m:oMath>
+        <m:r>
+          <m:t>​</m:t>
+        </m:r>
+        <m:d>
+          <m:dPr>
+            <m:begChr m:val="["/>
+            <m:sepChr m:val=""/>
+            <m:endChr m:val="]"/>
+            <m:grow/>
+          </m:dPr>
+          <m:e>
+            <m:r>
+              <m:t>L</m:t>
+            </m:r>
+            <m:r>
+              <m:t>​</m:t>
+            </m:r>
+            <m:d>
+              <m:dPr>
+                <m:begChr m:val="("/>
+                <m:sepChr m:val=""/>
+                <m:endChr m:val=")"/>
+                <m:grow/>
+              </m:dPr>
+              <m:e>
+                <m:r>
+                  <m:t>x</m:t>
+                </m:r>
+              </m:e>
+            </m:d>
+            <m:r>
+              <m:t>​</m:t>
+            </m:r>
+            <m:r>
+              <m:rPr>
+                <m:sty m:val="p"/>
+              </m:rPr>
+              <m:t>,</m:t>
+            </m:r>
+            <m:r>
+              <m:t>U</m:t>
+            </m:r>
+            <m:r>
+              <m:t>​</m:t>
+            </m:r>
+            <m:d>
+              <m:dPr>
+                <m:begChr m:val="("/>
+                <m:sepChr m:val=""/>
+                <m:endChr m:val=")"/>
+                <m:grow/>
+              </m:dPr>
+              <m:e>
+                <m:r>
+                  <m:t>x</m:t>
+                </m:r>
+              </m:e>
+            </m:d>
+            <m:r>
+              <m:t>​</m:t>
+            </m:r>
+          </m:e>
+        </m:d>
+        <m:r>
+          <m:t>​</m:t>
+        </m:r>
+      </m:oMath>
+      <w:r>
+        <w:t xml:space="preserve"> </w:t>
+      </w:r>
+      <w:r>
+        <w:t xml:space="preserve">contains</w:t>
+      </w:r>
+      <w:r>
+        <w:t xml:space="preserve"> </w:t>
+      </w:r>
+      <m:oMath>
+        <m:r>
+          <m:t>p</m:t>
+        </m:r>
+      </m:oMath>
+      <w:r>
+        <w:t xml:space="preserve">:</w:t>
+      </w:r>
+    </w:p>
+    <w:p>
+      <w:pPr>
+        <w:pStyle w:val="SourceCode"/>
+      </w:pPr>
+      <w:r>
+        <w:rPr>
+          <w:rStyle w:val="NormalTok"/>
+        </w:rPr>
+        <w:t xml:space="preserve">n </w:t>
+      </w:r>
+      <w:r>
+        <w:rPr>
+          <w:rStyle w:val="OtherTok"/>
+        </w:rPr>
+        <w:t xml:space="preserve">&lt;-</w:t>
+      </w:r>
+      <w:r>
+        <w:rPr>
+          <w:rStyle w:val="NormalTok"/>
+        </w:rPr>
+        <w:t xml:space="preserve"> </w:t>
+      </w:r>
+      <w:r>
+        <w:rPr>
+          <w:rStyle w:val="DecValTok"/>
+        </w:rPr>
+        <w:t xml:space="preserve">20</w:t>
+      </w:r>
+      <w:r>
+        <w:br/>
+      </w:r>
+      <w:r>
+        <w:rPr>
+          <w:rStyle w:val="NormalTok"/>
+        </w:rPr>
+        <w:t xml:space="preserve">cp </w:t>
+      </w:r>
+      <w:r>
+        <w:rPr>
+          <w:rStyle w:val="OtherTok"/>
+        </w:rPr>
+        <w:t xml:space="preserve">&lt;-</w:t>
+      </w:r>
+      <w:r>
+        <w:rPr>
+          <w:rStyle w:val="NormalTok"/>
+        </w:rPr>
+        <w:t xml:space="preserve"> </w:t>
+      </w:r>
+      <w:r>
+        <w:rPr>
+          <w:rStyle w:val="FunctionTok"/>
+        </w:rPr>
+        <w:t xml:space="preserve">t</w:t>
+      </w:r>
+      <w:r>
+        <w:rPr>
+          <w:rStyle w:val="NormalTok"/>
+        </w:rPr>
+        <w:t xml:space="preserve">(</w:t>
+      </w:r>
+      <w:r>
+        <w:rPr>
+          <w:rStyle w:val="FunctionTok"/>
+        </w:rPr>
+        <w:t xml:space="preserve">sapply</w:t>
+      </w:r>
+      <w:r>
+        <w:rPr>
+          <w:rStyle w:val="NormalTok"/>
+        </w:rPr>
+        <w:t xml:space="preserve">(</w:t>
+      </w:r>
+      <w:r>
+        <w:rPr>
+          <w:rStyle w:val="DecValTok"/>
+        </w:rPr>
+        <w:t xml:space="preserve">0</w:t>
+      </w:r>
+      <w:r>
+        <w:rPr>
+          <w:rStyle w:val="SpecialCharTok"/>
+        </w:rPr>
+        <w:t xml:space="preserve">:</w:t>
+      </w:r>
+      <w:r>
+        <w:rPr>
+          <w:rStyle w:val="NormalTok"/>
+        </w:rPr>
+        <w:t xml:space="preserve">n, </w:t>
+      </w:r>
+      <w:r>
+        <w:rPr>
+          <w:rStyle w:val="ControlFlowTok"/>
+        </w:rPr>
+        <w:t xml:space="preserve">function</w:t>
+      </w:r>
+      <w:r>
+        <w:rPr>
+          <w:rStyle w:val="NormalTok"/>
+        </w:rPr>
+        <w:t xml:space="preserve">(x) </w:t>
+      </w:r>
+      <w:r>
+        <w:rPr>
+          <w:rStyle w:val="FunctionTok"/>
+        </w:rPr>
+        <w:t xml:space="preserve">binom.test</w:t>
+      </w:r>
+      <w:r>
+        <w:rPr>
+          <w:rStyle w:val="NormalTok"/>
+        </w:rPr>
+        <w:t xml:space="preserve">(x, n)</w:t>
+      </w:r>
+      <w:r>
+        <w:rPr>
+          <w:rStyle w:val="SpecialCharTok"/>
+        </w:rPr>
+        <w:t xml:space="preserve">$</w:t>
+      </w:r>
+      <w:r>
+        <w:rPr>
+          <w:rStyle w:val="NormalTok"/>
+        </w:rPr>
+        <w:t xml:space="preserve">conf.int))</w:t>
+      </w:r>
+      <w:r>
+        <w:br/>
+      </w:r>
+      <w:r>
+        <w:rPr>
+          <w:rStyle w:val="NormalTok"/>
+        </w:rPr>
+        <w:t xml:space="preserve">coverage </w:t>
+      </w:r>
+      <w:r>
+        <w:rPr>
+          <w:rStyle w:val="OtherTok"/>
+        </w:rPr>
+        <w:t xml:space="preserve">&lt;-</w:t>
+      </w:r>
+      <w:r>
+        <w:rPr>
+          <w:rStyle w:val="NormalTok"/>
+        </w:rPr>
+        <w:t xml:space="preserve"> </w:t>
+      </w:r>
+      <w:r>
+        <w:rPr>
+          <w:rStyle w:val="ControlFlowTok"/>
+        </w:rPr>
+        <w:t xml:space="preserve">function</w:t>
+      </w:r>
+      <w:r>
+        <w:rPr>
+          <w:rStyle w:val="NormalTok"/>
+        </w:rPr>
+        <w:t xml:space="preserve">(p) {</w:t>
+      </w:r>
+      <w:r>
+        <w:br/>
+      </w:r>
+      <w:r>
+        <w:rPr>
+          <w:rStyle w:val="NormalTok"/>
+        </w:rPr>
+        <w:t xml:space="preserve">  </w:t>
+      </w:r>
+      <w:r>
+        <w:rPr>
+          <w:rStyle w:val="FunctionTok"/>
+        </w:rPr>
+        <w:t xml:space="preserve">sum</w:t>
+      </w:r>
+      <w:r>
+        <w:rPr>
+          <w:rStyle w:val="NormalTok"/>
+        </w:rPr>
+        <w:t xml:space="preserve">(</w:t>
+      </w:r>
+      <w:r>
+        <w:rPr>
+          <w:rStyle w:val="FunctionTok"/>
+        </w:rPr>
+        <w:t xml:space="preserve">dbinom</w:t>
+      </w:r>
+      <w:r>
+        <w:rPr>
+          <w:rStyle w:val="NormalTok"/>
+        </w:rPr>
+        <w:t xml:space="preserve">(</w:t>
+      </w:r>
+      <w:r>
+        <w:rPr>
+          <w:rStyle w:val="DecValTok"/>
+        </w:rPr>
+        <w:t xml:space="preserve">0</w:t>
+      </w:r>
+      <w:r>
+        <w:rPr>
+          <w:rStyle w:val="SpecialCharTok"/>
+        </w:rPr>
+        <w:t xml:space="preserve">:</w:t>
+      </w:r>
+      <w:r>
+        <w:rPr>
+          <w:rStyle w:val="NormalTok"/>
+        </w:rPr>
+        <w:t xml:space="preserve">n, n, p)[cp[, </w:t>
+      </w:r>
+      <w:r>
+        <w:rPr>
+          <w:rStyle w:val="DecValTok"/>
+        </w:rPr>
+        <w:t xml:space="preserve">1</w:t>
+      </w:r>
+      <w:r>
+        <w:rPr>
+          <w:rStyle w:val="NormalTok"/>
+        </w:rPr>
+        <w:t xml:space="preserve">] </w:t>
+      </w:r>
+      <w:r>
+        <w:rPr>
+          <w:rStyle w:val="SpecialCharTok"/>
+        </w:rPr>
+        <w:t xml:space="preserve">&lt;=</w:t>
+      </w:r>
+      <w:r>
+        <w:rPr>
+          <w:rStyle w:val="NormalTok"/>
+        </w:rPr>
+        <w:t xml:space="preserve"> p </w:t>
+      </w:r>
+      <w:r>
+        <w:rPr>
+          <w:rStyle w:val="SpecialCharTok"/>
+        </w:rPr>
+        <w:t xml:space="preserve">&amp;</w:t>
+      </w:r>
+      <w:r>
+        <w:rPr>
+          <w:rStyle w:val="NormalTok"/>
+        </w:rPr>
+        <w:t xml:space="preserve"> p </w:t>
+      </w:r>
+      <w:r>
+        <w:rPr>
+          <w:rStyle w:val="SpecialCharTok"/>
+        </w:rPr>
+        <w:t xml:space="preserve">&lt;=</w:t>
+      </w:r>
+      <w:r>
+        <w:rPr>
+          <w:rStyle w:val="NormalTok"/>
+        </w:rPr>
+        <w:t xml:space="preserve"> cp[, </w:t>
+      </w:r>
+      <w:r>
+        <w:rPr>
+          <w:rStyle w:val="DecValTok"/>
+        </w:rPr>
+        <w:t xml:space="preserve">2</w:t>
+      </w:r>
+      <w:r>
+        <w:rPr>
+          <w:rStyle w:val="NormalTok"/>
+        </w:rPr>
+        <w:t xml:space="preserve">]])</w:t>
+      </w:r>
+      <w:r>
+        <w:br/>
+      </w:r>
+      <w:r>
+        <w:rPr>
+          <w:rStyle w:val="NormalTok"/>
+        </w:rPr>
+        <w:t xml:space="preserve">}</w:t>
+      </w:r>
+      <w:r>
+        <w:br/>
+      </w:r>
+      <w:r>
+        <w:rPr>
+          <w:rStyle w:val="NormalTok"/>
+        </w:rPr>
+        <w:t xml:space="preserve">p_grid </w:t>
+      </w:r>
+      <w:r>
+        <w:rPr>
+          <w:rStyle w:val="OtherTok"/>
+        </w:rPr>
+        <w:t xml:space="preserve">&lt;-</w:t>
+      </w:r>
+      <w:r>
+        <w:rPr>
+          <w:rStyle w:val="NormalTok"/>
+        </w:rPr>
+        <w:t xml:space="preserve"> </w:t>
+      </w:r>
+      <w:r>
+        <w:rPr>
+          <w:rStyle w:val="FunctionTok"/>
+        </w:rPr>
+        <w:t xml:space="preserve">seq</w:t>
+      </w:r>
+      <w:r>
+        <w:rPr>
+          <w:rStyle w:val="NormalTok"/>
+        </w:rPr>
+        <w:t xml:space="preserve">(</w:t>
+      </w:r>
+      <w:r>
+        <w:rPr>
+          <w:rStyle w:val="FloatTok"/>
+        </w:rPr>
+        <w:t xml:space="preserve">0.01</w:t>
+      </w:r>
+      <w:r>
+        <w:rPr>
+          <w:rStyle w:val="NormalTok"/>
+        </w:rPr>
+        <w:t xml:space="preserve">, </w:t>
+      </w:r>
+      <w:r>
+        <w:rPr>
+          <w:rStyle w:val="FloatTok"/>
+        </w:rPr>
+        <w:t xml:space="preserve">0.99</w:t>
+      </w:r>
+      <w:r>
+        <w:rPr>
+          <w:rStyle w:val="NormalTok"/>
+        </w:rPr>
+        <w:t xml:space="preserve">, </w:t>
+      </w:r>
+      <w:r>
+        <w:rPr>
+          <w:rStyle w:val="AttributeTok"/>
+        </w:rPr>
+        <w:t xml:space="preserve">by =</w:t>
+      </w:r>
+      <w:r>
+        <w:rPr>
+          <w:rStyle w:val="NormalTok"/>
+        </w:rPr>
+        <w:t xml:space="preserve"> </w:t>
+      </w:r>
+      <w:r>
+        <w:rPr>
+          <w:rStyle w:val="FloatTok"/>
+        </w:rPr>
+        <w:t xml:space="preserve">0.01</w:t>
+      </w:r>
+      <w:r>
+        <w:rPr>
+          <w:rStyle w:val="NormalTok"/>
+        </w:rPr>
+        <w:t xml:space="preserve">)</w:t>
+      </w:r>
+      <w:r>
+        <w:br/>
+      </w:r>
+      <w:r>
+        <w:rPr>
+          <w:rStyle w:val="NormalTok"/>
+        </w:rPr>
+        <w:t xml:space="preserve">cover </w:t>
+      </w:r>
+      <w:r>
+        <w:rPr>
+          <w:rStyle w:val="OtherTok"/>
+        </w:rPr>
+        <w:t xml:space="preserve">&lt;-</w:t>
+      </w:r>
+      <w:r>
+        <w:rPr>
+          <w:rStyle w:val="NormalTok"/>
+        </w:rPr>
+        <w:t xml:space="preserve"> </w:t>
+      </w:r>
+      <w:r>
+        <w:rPr>
+          <w:rStyle w:val="FunctionTok"/>
+        </w:rPr>
+        <w:t xml:space="preserve">sapply</w:t>
+      </w:r>
+      <w:r>
+        <w:rPr>
+          <w:rStyle w:val="NormalTok"/>
+        </w:rPr>
+        <w:t xml:space="preserve">(p_grid, coverage)</w:t>
+      </w:r>
+      <w:r>
+        <w:br/>
+      </w:r>
+      <w:r>
+        <w:rPr>
+          <w:rStyle w:val="FunctionTok"/>
+        </w:rPr>
+        <w:t xml:space="preserve">range</w:t>
+      </w:r>
+      <w:r>
+        <w:rPr>
+          <w:rStyle w:val="NormalTok"/>
+        </w:rPr>
+        <w:t xml:space="preserve">(cover)</w:t>
+      </w:r>
+      <w:r>
+        <w:br/>
+      </w:r>
+      <w:r>
+        <w:rPr>
+          <w:rStyle w:val="CommentTok"/>
+        </w:rPr>
+        <w:t xml:space="preserve">#&gt; [1] 0.958611 0.994366</w:t>
+      </w:r>
+    </w:p>
+    <w:p>
+      <w:pPr>
+        <w:pStyle w:val="FirstParagraph"/>
+      </w:pPr>
+      <w:r>
+        <w:t xml:space="preserve">The smallest coverage probability on this grid is 0.959,</w:t>
+      </w:r>
+      <w:r>
+        <w:t xml:space="preserve"> </w:t>
+      </w:r>
+      <w:r>
+        <w:t xml:space="preserve">and the largest is 0.994.</w:t>
+      </w:r>
+      <w:r>
+        <w:t xml:space="preserve"> </w:t>
+      </w:r>
+      <w:r>
+        <w:t xml:space="preserve">The grid is coarse and the coverage probability jumps at the interval endpoints,</w:t>
+      </w:r>
+      <w:r>
+        <w:t xml:space="preserve"> </w:t>
+      </w:r>
+      <w:r>
+        <w:t xml:space="preserve">so the smallest grid value is only an</w:t>
+      </w:r>
+      <w:r>
+        <w:t xml:space="preserve"> </w:t>
+      </w:r>
+      <w:hyperlink r:id="rId47">
+        <w:r>
+          <w:rPr>
+            <w:rStyle w:val="Hyperlink"/>
+          </w:rPr>
+          <w:t xml:space="preserve">upper bound</w:t>
+        </w:r>
+      </w:hyperlink>
+      <w:r>
+        <w:t xml:space="preserve"> </w:t>
+      </w:r>
+      <w:r>
+        <w:t xml:space="preserve">for the</w:t>
+      </w:r>
+      <w:r>
+        <w:t xml:space="preserve"> </w:t>
+      </w:r>
+      <w:hyperlink w:anchor="def-confidence-coefficient">
+        <w:r>
+          <w:rPr>
+            <w:rStyle w:val="Hyperlink"/>
+          </w:rPr>
+          <w:t xml:space="preserve">confidence coefficient</w:t>
+        </w:r>
+      </w:hyperlink>
+      <w:r>
+        <w:t xml:space="preserve">.</w:t>
+      </w:r>
+      <w:r>
+        <w:t xml:space="preserve"> </w:t>
+      </w:r>
+      <w:r>
+        <w:t xml:space="preserve">The Clopper-Pearson interval is built to have coverage probability at least 0.95</w:t>
+      </w:r>
+      <w:r>
+        <w:t xml:space="preserve"> </w:t>
+      </w:r>
+      <w:r>
+        <w:t xml:space="preserve">at every</w:t>
+      </w:r>
+      <w:r>
+        <w:t xml:space="preserve"> </w:t>
+      </w:r>
+      <m:oMath>
+        <m:r>
+          <m:t>p</m:t>
+        </m:r>
+      </m:oMath>
+      <w:r>
+        <w:t xml:space="preserve">,</w:t>
+      </w:r>
+      <w:r>
+        <w:t xml:space="preserve"> </w:t>
+      </w:r>
+      <w:r>
+        <w:t xml:space="preserve">and here it is above 0.95 at</w:t>
+      </w:r>
+      <w:r>
+        <w:t xml:space="preserve"> </w:t>
+      </w:r>
+      <w:r>
+        <w:t xml:space="preserve">all</w:t>
+      </w:r>
+      <w:r>
+        <w:t xml:space="preserve"> </w:t>
+      </w:r>
+      <w:r>
+        <w:t xml:space="preserve">99 grid values of</w:t>
+      </w:r>
+      <w:r>
+        <w:t xml:space="preserve"> </w:t>
+      </w:r>
+      <m:oMath>
+        <m:r>
+          <m:t>p</m:t>
+        </m:r>
+      </m:oMath>
+      <w:r>
+        <w:t xml:space="preserve">,</w:t>
+      </w:r>
+      <w:r>
+        <w:t xml:space="preserve"> </w:t>
+      </w:r>
+      <w:r>
+        <w:t xml:space="preserve">so it is</w:t>
+      </w:r>
+      <w:r>
+        <w:t xml:space="preserve"> </w:t>
+      </w:r>
+      <w:hyperlink w:anchor="def-conservative-confidence-interval">
+        <w:r>
+          <w:rPr>
+            <w:rStyle w:val="Hyperlink"/>
+          </w:rPr>
+          <w:t xml:space="preserve">conservative</w:t>
+        </w:r>
+      </w:hyperlink>
+      <w:r>
+        <w:t xml:space="preserve">.</w:t>
+      </w:r>
+    </w:p>
+    <w:bookmarkEnd w:id="48"/>
+    <w:bookmarkStart w:id="50" w:name="rem-confidence-interval-exact"/>
+    <w:p>
+      <w:pPr>
+        <w:pStyle w:val="BodyText"/>
+      </w:pPr>
+      <w:r>
+        <w:rPr>
+          <w:i/>
+          <w:iCs/>
+        </w:rPr>
+        <w:t xml:space="preserve">Remark 3</w:t>
+      </w:r>
+      <w:r>
+        <w:t xml:space="preserve"> (Why most intervals are conservative). </w:t>
+      </w:r>
+      <w:hyperlink w:anchor="def-confidence-interval">
+        <w:r>
+          <w:rPr>
+            <w:rStyle w:val="Hyperlink"/>
+          </w:rPr>
+          <w:t xml:space="preserve">Definition 12</w:t>
+        </w:r>
+      </w:hyperlink>
+      <w:r>
+        <w:t xml:space="preserve"> </w:t>
+      </w:r>
+      <w:r>
+        <w:t xml:space="preserve">requires the</w:t>
+      </w:r>
+      <w:r>
+        <w:t xml:space="preserve"> </w:t>
+      </w:r>
+      <w:hyperlink w:anchor="def-coverage-probability">
+        <w:r>
+          <w:rPr>
+            <w:rStyle w:val="Hyperlink"/>
+          </w:rPr>
+          <w:t xml:space="preserve">coverage probability</w:t>
+        </w:r>
+      </w:hyperlink>
+      <w:r>
+        <w:t xml:space="preserve"> </w:t>
+      </w:r>
+      <w:r>
+        <w:t xml:space="preserve">to be at least</w:t>
+      </w:r>
+      <w:r>
+        <w:t xml:space="preserve"> </w:t>
+      </w:r>
+      <m:oMath>
+        <m:r>
+          <m:t>1</m:t>
+        </m:r>
+        <m:r>
+          <m:rPr>
+            <m:sty m:val="p"/>
+          </m:rPr>
+          <m:t>−</m:t>
+        </m:r>
+        <m:r>
+          <m:t>α</m:t>
+        </m:r>
+      </m:oMath>
+      <w:r>
+        <w:t xml:space="preserve"> </w:t>
+      </w:r>
+      <w:r>
+        <w:t xml:space="preserve">at every</w:t>
+      </w:r>
+      <w:r>
+        <w:t xml:space="preserve"> </w:t>
+      </w:r>
+      <m:oMath>
+        <m:r>
+          <m:t>θ</m:t>
+        </m:r>
+      </m:oMath>
+      <w:r>
+        <w:t xml:space="preserve">,</w:t>
+      </w:r>
+      <w:r>
+        <w:t xml:space="preserve"> </w:t>
+      </w:r>
+      <w:r>
+        <w:t xml:space="preserve">which is the same as requiring the</w:t>
+      </w:r>
+      <w:r>
+        <w:t xml:space="preserve"> </w:t>
+      </w:r>
+      <w:hyperlink w:anchor="def-confidence-coefficient">
+        <w:r>
+          <w:rPr>
+            <w:rStyle w:val="Hyperlink"/>
+          </w:rPr>
+          <w:t xml:space="preserve">confidence coefficient</w:t>
+        </w:r>
+      </w:hyperlink>
+      <w:r>
+        <w:t xml:space="preserve"> </w:t>
+      </w:r>
+      <w:r>
+        <w:t xml:space="preserve">to be at least</w:t>
+      </w:r>
+      <w:r>
+        <w:t xml:space="preserve"> </w:t>
+      </w:r>
+      <m:oMath>
+        <m:r>
+          <m:t>1</m:t>
+        </m:r>
+        <m:r>
+          <m:rPr>
+            <m:sty m:val="p"/>
+          </m:rPr>
+          <m:t>−</m:t>
+        </m:r>
+        <m:r>
+          <m:t>α</m:t>
+        </m:r>
+      </m:oMath>
+      <w:r>
+        <w:t xml:space="preserve">.</w:t>
+      </w:r>
+      <w:r>
+        <w:t xml:space="preserve"> </w:t>
+      </w:r>
+      <w:r>
+        <w:t xml:space="preserve">The coverage probability can depend on</w:t>
+      </w:r>
+      <w:r>
+        <w:t xml:space="preserve"> </w:t>
+      </w:r>
+      <m:oMath>
+        <m:r>
+          <m:t>θ</m:t>
+        </m:r>
+      </m:oMath>
+      <w:r>
+        <w:t xml:space="preserve">,</w:t>
+      </w:r>
+      <w:r>
+        <w:t xml:space="preserve"> </w:t>
+      </w:r>
+      <w:r>
+        <w:t xml:space="preserve">and the confidence coefficient is its greatest</w:t>
+      </w:r>
+      <w:r>
+        <w:t xml:space="preserve"> </w:t>
+      </w:r>
+      <w:hyperlink r:id="rId47">
+        <w:r>
+          <w:rPr>
+            <w:rStyle w:val="Hyperlink"/>
+          </w:rPr>
+          <w:t xml:space="preserve">lower bound</w:t>
+        </w:r>
+      </w:hyperlink>
+      <w:r>
+        <w:t xml:space="preserve">,</w:t>
+      </w:r>
+      <w:r>
+        <w:t xml:space="preserve"> </w:t>
+      </w:r>
+      <w:r>
+        <w:t xml:space="preserve">which the coverage probability need not attain at any</w:t>
+      </w:r>
+      <w:r>
+        <w:t xml:space="preserve"> </w:t>
+      </w:r>
+      <m:oMath>
+        <m:r>
+          <m:t>θ</m:t>
+        </m:r>
+      </m:oMath>
+      <w:r>
+        <w:t xml:space="preserve">.</w:t>
+      </w:r>
+      <w:r>
+        <w:t xml:space="preserve"> </w:t>
+      </w:r>
+      <w:r>
+        <w:t xml:space="preserve">An</w:t>
+      </w:r>
+      <w:r>
+        <w:t xml:space="preserve"> </w:t>
+      </w:r>
+      <w:hyperlink w:anchor="def-exact-confidence-interval">
+        <w:r>
+          <w:rPr>
+            <w:rStyle w:val="Hyperlink"/>
+          </w:rPr>
+          <w:t xml:space="preserve">exact</w:t>
+        </w:r>
+      </w:hyperlink>
+      <w:r>
+        <w:t xml:space="preserve"> </w:t>
+      </w:r>
+      <w:r>
+        <w:t xml:space="preserve">interval has the same coverage probability</w:t>
+      </w:r>
+      <w:r>
+        <w:t xml:space="preserve"> </w:t>
+      </w:r>
+      <w:r>
+        <w:t xml:space="preserve">at every</w:t>
+      </w:r>
+      <w:r>
+        <w:t xml:space="preserve"> </w:t>
+      </w:r>
+      <m:oMath>
+        <m:r>
+          <m:t>θ</m:t>
+        </m:r>
+      </m:oMath>
+      <w:r>
+        <w:t xml:space="preserve">.</w:t>
+      </w:r>
+      <w:r>
+        <w:t xml:space="preserve"> </w:t>
+      </w:r>
+      <w:hyperlink r:id="rId49">
+        <w:r>
+          <w:rPr>
+            <w:rStyle w:val="Hyperlink"/>
+          </w:rPr>
+          <w:t xml:space="preserve">Discrete</w:t>
+        </w:r>
+      </w:hyperlink>
+      <w:r>
+        <w:t xml:space="preserve"> </w:t>
+      </w:r>
+      <w:r>
+        <w:t xml:space="preserve">data take only countably many values,</w:t>
+      </w:r>
+      <w:r>
+        <w:t xml:space="preserve"> </w:t>
+      </w:r>
+      <w:r>
+        <w:t xml:space="preserve">so they usually allow only a</w:t>
+      </w:r>
+      <w:r>
+        <w:t xml:space="preserve"> </w:t>
+      </w:r>
+      <w:hyperlink w:anchor="def-conservative-confidence-interval">
+        <w:r>
+          <w:rPr>
+            <w:rStyle w:val="Hyperlink"/>
+          </w:rPr>
+          <w:t xml:space="preserve">conservative</w:t>
+        </w:r>
+      </w:hyperlink>
+      <w:r>
+        <w:t xml:space="preserve"> </w:t>
+      </w:r>
+      <w:r>
+        <w:t xml:space="preserve">interval,</w:t>
+      </w:r>
+      <w:r>
+        <w:t xml:space="preserve"> </w:t>
+      </w:r>
+      <w:r>
+        <w:t xml:space="preserve">as</w:t>
+      </w:r>
+      <w:r>
+        <w:t xml:space="preserve"> </w:t>
+      </w:r>
+      <w:hyperlink w:anchor="exm-conservative-interval">
+        <w:r>
+          <w:rPr>
+            <w:rStyle w:val="Hyperlink"/>
+          </w:rPr>
+          <w:t xml:space="preserve">Example 7</w:t>
+        </w:r>
+      </w:hyperlink>
+      <w:r>
+        <w:t xml:space="preserve"> </w:t>
+      </w:r>
+      <w:r>
+        <w:t xml:space="preserve">shows.</w:t>
+      </w:r>
+      <w:r>
+        <w:t xml:space="preserve"> </w:t>
+      </w:r>
+      <w:r>
+        <w:t xml:space="preserve">A</w:t>
+      </w:r>
+      <w:r>
+        <w:t xml:space="preserve"> </w:t>
+      </w:r>
+      <w:hyperlink w:anchor="def-confidence-set">
+        <w:r>
+          <w:rPr>
+            <w:rStyle w:val="Hyperlink"/>
+          </w:rPr>
+          <w:t xml:space="preserve">confidence set</w:t>
+        </w:r>
+      </w:hyperlink>
+      <w:r>
+        <w:t xml:space="preserve"> </w:t>
+      </w:r>
+      <w:r>
+        <w:t xml:space="preserve">drops the requirement that the region be an interval.</w:t>
+      </w:r>
+    </w:p>
+    <w:bookmarkEnd w:id="50"/>
+    <w:bookmarkStart w:id="51" w:name="def-approximate-ci"/>
+    <w:p>
+      <w:pPr>
+        <w:pStyle w:val="BodyText"/>
+      </w:pPr>
+      <w:r>
+        <w:rPr>
+          <w:b/>
+          <w:bCs/>
+        </w:rPr>
+        <w:t xml:space="preserve">Definition 18 (Approximate confidence interval)</w:t>
+      </w:r>
+      <w:r>
+        <w:t xml:space="preserve"> </w:t>
+      </w:r>
+      <w:r>
+        <w:t xml:space="preserve">An</w:t>
+      </w:r>
+      <w:r>
+        <w:t xml:space="preserve"> </w:t>
+      </w:r>
+      <w:r>
+        <w:rPr>
+          <w:b/>
+          <w:bCs/>
+        </w:rPr>
+        <w:t xml:space="preserve">approximate</w:t>
+      </w:r>
+      <w:r>
+        <w:t xml:space="preserve"> </w:t>
+      </w:r>
+      <m:oMath>
+        <m:r>
+          <m:t>100</m:t>
+        </m:r>
+        <m:r>
+          <m:rPr>
+            <m:sty m:val="p"/>
+          </m:rPr>
+          <m:t>(</m:t>
+        </m:r>
+        <m:r>
+          <m:t>1</m:t>
+        </m:r>
+        <m:r>
+          <m:rPr>
+            <m:sty m:val="p"/>
+          </m:rPr>
+          <m:t>−</m:t>
+        </m:r>
+        <m:r>
+          <m:t>α</m:t>
+        </m:r>
+        <m:r>
+          <m:rPr>
+            <m:sty m:val="p"/>
+          </m:rPr>
+          <m:t>)</m:t>
+        </m:r>
+        <m:r>
+          <m:rPr>
+            <m:sty m:val="p"/>
+          </m:rPr>
+          <m:t>%</m:t>
+        </m:r>
+      </m:oMath>
+      <w:r>
+        <w:t xml:space="preserve"> </w:t>
+      </w:r>
+      <w:r>
+        <w:t xml:space="preserve">confidence interval</w:t>
+      </w:r>
+      <w:r>
+        <w:t xml:space="preserve"> </w:t>
+      </w:r>
+      <w:r>
+        <w:t xml:space="preserve">is an interval whose</w:t>
+      </w:r>
+      <w:r>
+        <w:t xml:space="preserve"> </w:t>
+      </w:r>
+      <w:hyperlink w:anchor="def-coverage-probability">
+        <w:r>
+          <w:rPr>
+            <w:rStyle w:val="Hyperlink"/>
+          </w:rPr>
+          <w:t xml:space="preserve">coverage probability</w:t>
+        </w:r>
+      </w:hyperlink>
+      <w:r>
+        <w:t xml:space="preserve"> </w:t>
+      </w:r>
+      <w:r>
+        <w:t xml:space="preserve">is approximately</w:t>
+      </w:r>
+      <w:r>
+        <w:t xml:space="preserve"> </w:t>
+      </w:r>
+      <m:oMath>
+        <m:r>
+          <m:t>1</m:t>
+        </m:r>
+        <m:r>
+          <m:rPr>
+            <m:sty m:val="p"/>
+          </m:rPr>
+          <m:t>−</m:t>
+        </m:r>
+        <m:r>
+          <m:t>α</m:t>
+        </m:r>
+      </m:oMath>
+      <w:r>
+        <w:t xml:space="preserve">,</w:t>
+      </w:r>
+      <w:r>
+        <w:t xml:space="preserve"> </w:t>
+      </w:r>
+      <w:r>
+        <w:t xml:space="preserve">for example only in large samples.</w:t>
+      </w:r>
+    </w:p>
+    <w:bookmarkEnd w:id="51"/>
+    <w:bookmarkStart w:id="53" w:name="exm-confidence-interval-wcgs"/>
+    <w:p>
+      <w:pPr>
+        <w:pStyle w:val="BodyText"/>
+      </w:pPr>
+      <w:r>
+        <w:rPr>
+          <w:b/>
+          <w:bCs/>
+        </w:rPr>
+        <w:t xml:space="preserve">Example 8 (Confidence interval for population mean cholesterol in the WCGS)</w:t>
       </w:r>
       <w:r>
         <w:t xml:space="preserve"> </w:t>
@@ -6065,7 +8721,7 @@
       <w:r>
         <w:t xml:space="preserve"> </w:t>
       </w:r>
-      <w:hyperlink r:id="rId40">
+      <w:hyperlink r:id="rId52">
         <w:r>
           <w:rPr>
             <w:rStyle w:val="Hyperlink"/>
@@ -6572,8 +9228,8 @@
         <w:t xml:space="preserve">#&gt; 224.854 227.891</w:t>
       </w:r>
     </w:p>
-    <w:bookmarkEnd w:id="41"/>
-    <w:bookmarkStart w:id="42" w:name="def-margin-error"/>
+    <w:bookmarkEnd w:id="53"/>
+    <w:bookmarkStart w:id="54" w:name="def-margin-error"/>
     <w:p>
       <w:pPr>
         <w:pStyle w:val="FirstParagraph"/>
@@ -6583,7 +9239,7 @@
           <w:b/>
           <w:bCs/>
         </w:rPr>
-        <w:t xml:space="preserve">Definition 15 (Margin of error (radius))</w:t>
+        <w:t xml:space="preserve">Definition 19 (Margin of error (radius))</w:t>
       </w:r>
       <w:r>
         <w:t xml:space="preserve"> </w:t>
@@ -6649,14 +9305,14 @@
         <w:t xml:space="preserve"> </w:t>
       </w:r>
       <w:r>
-        <w:t xml:space="preserve">Wikipedia contributors [15]</w:t>
+        <w:t xml:space="preserve">Wikipedia contributors [13]</w:t>
       </w:r>
       <w:r>
         <w:t xml:space="preserve">.</w:t>
       </w:r>
     </w:p>
-    <w:bookmarkEnd w:id="42"/>
-    <w:bookmarkStart w:id="43" w:name="exm-margin-error"/>
+    <w:bookmarkEnd w:id="54"/>
+    <w:bookmarkStart w:id="55" w:name="exm-margin-error"/>
     <w:p>
       <w:pPr>
         <w:pStyle w:val="BodyText"/>
@@ -6666,7 +9322,7 @@
           <w:b/>
           <w:bCs/>
         </w:rPr>
-        <w:t xml:space="preserve">Example 8 (Margin of error for population mean cholesterol)</w:t>
+        <w:t xml:space="preserve">Example 9 (Margin of error for population mean cholesterol)</w:t>
       </w:r>
       <w:r>
         <w:t xml:space="preserve"> </w:t>
@@ -6682,7 +9338,7 @@
           <w:rPr>
             <w:rStyle w:val="Hyperlink"/>
           </w:rPr>
-          <w:t xml:space="preserve">Example 7</w:t>
+          <w:t xml:space="preserve">Example 8</w:t>
         </w:r>
       </w:hyperlink>
       <w:r>
@@ -6750,7 +9406,7 @@
         <w:t xml:space="preserve">1.52 mg/dL.</w:t>
       </w:r>
     </w:p>
-    <w:bookmarkEnd w:id="43"/>
+    <w:bookmarkEnd w:id="55"/>
     <w:p>
       <w:pPr>
         <w:pStyle w:val="BodyText"/>
@@ -6761,7 +9417,7 @@
       <w:r>
         <w:t xml:space="preserve"> </w:t>
       </w:r>
-      <w:hyperlink r:id="rId44">
+      <w:hyperlink r:id="rId56">
         <w:r>
           <w:rPr>
             <w:rStyle w:val="Hyperlink"/>
@@ -6845,8 +9501,8 @@
         <w:t xml:space="preserve">covers duality of confidence intervals and hypothesis tests.</w:t>
       </w:r>
     </w:p>
-    <w:bookmarkEnd w:id="45"/>
-    <w:bookmarkStart w:id="48" w:name="further-reading-on-confidence-intervals"/>
+    <w:bookmarkEnd w:id="57"/>
+    <w:bookmarkStart w:id="60" w:name="further-reading-on-confidence-intervals"/>
     <w:p>
       <w:pPr>
         <w:pStyle w:val="Heading2"/>
@@ -6871,7 +9527,7 @@
           <w:numId w:val="1005"/>
         </w:numPr>
       </w:pPr>
-      <w:hyperlink r:id="rId46">
+      <w:hyperlink r:id="rId58">
         <w:r>
           <w:rPr>
             <w:rStyle w:val="Hyperlink"/>
@@ -6893,7 +9549,7 @@
           <w:numId w:val="1005"/>
         </w:numPr>
       </w:pPr>
-      <w:hyperlink r:id="rId47">
+      <w:hyperlink r:id="rId59">
         <w:r>
           <w:rPr>
             <w:rStyle w:val="Hyperlink"/>
@@ -6902,8 +9558,8 @@
         </w:r>
       </w:hyperlink>
     </w:p>
-    <w:bookmarkEnd w:id="48"/>
-    <w:bookmarkStart w:id="53" w:name="interpretation-of-negative-findings"/>
+    <w:bookmarkEnd w:id="60"/>
+    <w:bookmarkStart w:id="65" w:name="interpretation-of-negative-findings"/>
     <w:p>
       <w:pPr>
         <w:pStyle w:val="Heading2"/>
@@ -7196,7 +9852,7 @@
       <w:tr>
         <w:tc>
           <w:tcPr/>
-          <w:bookmarkStart w:id="52" w:name="fig-CI-interp"/>
+          <w:bookmarkStart w:id="64" w:name="fig-CI-interp"/>
           <w:p>
             <w:pPr>
               <w:pStyle w:val="SourceCode"/>
@@ -8127,18 +10783,18 @@
                 <wp:inline>
                   <wp:extent cx="5334000" cy="3000375"/>
                   <wp:effectExtent b="0" l="0" r="0" t="0"/>
-                  <wp:docPr descr="" title="" id="50" name="Picture"/>
+                  <wp:docPr descr="" title="" id="62" name="Picture"/>
                   <a:graphic>
                     <a:graphicData uri="http://schemas.openxmlformats.org/drawingml/2006/picture">
                       <pic:pic>
                         <pic:nvPicPr>
-                          <pic:cNvPr descr="inference_files/figure-docx/unnamed-chunk-6-1.png" id="51" name="Picture"/>
+                          <pic:cNvPr descr="inference_files/figure-docx/unnamed-chunk-7-1.png" id="63" name="Picture"/>
                           <pic:cNvPicPr>
                             <a:picLocks noChangeArrowheads="1" noChangeAspect="1"/>
                           </pic:cNvPicPr>
                         </pic:nvPicPr>
                         <pic:blipFill>
-                          <a:blip r:embed="rId49"/>
+                          <a:blip r:embed="rId61"/>
                           <a:stretch>
                             <a:fillRect/>
                           </a:stretch>
@@ -8196,7 +10852,7 @@
               <w:t xml:space="preserve">Adapted from a whiteboard sketch made in office hours.</w:t>
             </w:r>
           </w:p>
-          <w:bookmarkEnd w:id="52"/>
+          <w:bookmarkEnd w:id="64"/>
         </w:tc>
       </w:tr>
     </w:tbl>
@@ -8211,14 +10867,14 @@
         <w:t xml:space="preserve"> </w:t>
       </w:r>
       <w:r>
-        <w:t xml:space="preserve">[16, Sec. 3.7]</w:t>
+        <w:t xml:space="preserve">[14, Sec. 3.7]</w:t>
       </w:r>
       <w:r>
         <w:t xml:space="preserve">.</w:t>
       </w:r>
     </w:p>
-    <w:bookmarkEnd w:id="53"/>
-    <w:bookmarkStart w:id="85" w:name="references"/>
+    <w:bookmarkEnd w:id="65"/>
+    <w:bookmarkStart w:id="93" w:name="references"/>
     <w:p>
       <w:pPr>
         <w:pStyle w:val="Heading2"/>
@@ -8227,8 +10883,8 @@
         <w:t xml:space="preserve">References</w:t>
       </w:r>
     </w:p>
-    <w:bookmarkStart w:id="84" w:name="refs"/>
-    <w:bookmarkStart w:id="55" w:name="ref-wp:statinference"/>
+    <w:bookmarkStart w:id="92" w:name="refs"/>
+    <w:bookmarkStart w:id="67" w:name="ref-wp:statinference"/>
     <w:p>
       <w:pPr>
         <w:pStyle w:val="Bibliography"/>
@@ -8275,7 +10931,7 @@
       <w:r>
         <w:t xml:space="preserve"> </w:t>
       </w:r>
-      <w:hyperlink r:id="rId54">
+      <w:hyperlink r:id="rId66">
         <w:r>
           <w:rPr>
             <w:rStyle w:val="Hyperlink"/>
@@ -8284,8 +10940,8 @@
         </w:r>
       </w:hyperlink>
     </w:p>
-    <w:bookmarkEnd w:id="55"/>
-    <w:bookmarkStart w:id="57" w:name="Xf91ac3e78483ea46cabb519605e11a427d8ba73"/>
+    <w:bookmarkEnd w:id="67"/>
+    <w:bookmarkStart w:id="69" w:name="Xf91ac3e78483ea46cabb519605e11a427d8ba73"/>
     <w:p>
       <w:pPr>
         <w:pStyle w:val="Bibliography"/>
@@ -8332,7 +10988,7 @@
       <w:r>
         <w:t xml:space="preserve"> </w:t>
       </w:r>
-      <w:hyperlink r:id="rId56">
+      <w:hyperlink r:id="rId68">
         <w:r>
           <w:rPr>
             <w:rStyle w:val="Hyperlink"/>
@@ -8341,8 +10997,8 @@
         </w:r>
       </w:hyperlink>
     </w:p>
-    <w:bookmarkEnd w:id="57"/>
-    <w:bookmarkStart w:id="59" w:name="ref-wikipedia_one_and_two_tailed_tests"/>
+    <w:bookmarkEnd w:id="69"/>
+    <w:bookmarkStart w:id="71" w:name="ref-wikipedia_one_and_two_tailed_tests"/>
     <w:p>
       <w:pPr>
         <w:pStyle w:val="Bibliography"/>
@@ -8389,7 +11045,7 @@
       <w:r>
         <w:t xml:space="preserve"> </w:t>
       </w:r>
-      <w:hyperlink r:id="rId58">
+      <w:hyperlink r:id="rId70">
         <w:r>
           <w:rPr>
             <w:rStyle w:val="Hyperlink"/>
@@ -8398,8 +11054,8 @@
         </w:r>
       </w:hyperlink>
     </w:p>
-    <w:bookmarkEnd w:id="59"/>
-    <w:bookmarkStart w:id="61" w:name="ref-wikipedia_test_statistic"/>
+    <w:bookmarkEnd w:id="71"/>
+    <w:bookmarkStart w:id="73" w:name="ref-wikipedia_test_statistic"/>
     <w:p>
       <w:pPr>
         <w:pStyle w:val="Bibliography"/>
@@ -8446,7 +11102,7 @@
       <w:r>
         <w:t xml:space="preserve"> </w:t>
       </w:r>
-      <w:hyperlink r:id="rId60">
+      <w:hyperlink r:id="rId72">
         <w:r>
           <w:rPr>
             <w:rStyle w:val="Hyperlink"/>
@@ -8455,8 +11111,8 @@
         </w:r>
       </w:hyperlink>
     </w:p>
-    <w:bookmarkEnd w:id="61"/>
-    <w:bookmarkStart w:id="63" w:name="ref-wikipedia_p_value"/>
+    <w:bookmarkEnd w:id="73"/>
+    <w:bookmarkStart w:id="75" w:name="ref-wikipedia_p_value"/>
     <w:p>
       <w:pPr>
         <w:pStyle w:val="Bibliography"/>
@@ -8503,7 +11159,7 @@
       <w:r>
         <w:t xml:space="preserve"> </w:t>
       </w:r>
-      <w:hyperlink r:id="rId62">
+      <w:hyperlink r:id="rId74">
         <w:r>
           <w:rPr>
             <w:rStyle w:val="Hyperlink"/>
@@ -8512,8 +11168,8 @@
         </w:r>
       </w:hyperlink>
     </w:p>
-    <w:bookmarkEnd w:id="63"/>
-    <w:bookmarkStart w:id="65" w:name="ref-wikipedia_statistical_significance"/>
+    <w:bookmarkEnd w:id="75"/>
+    <w:bookmarkStart w:id="77" w:name="ref-wikipedia_statistical_significance"/>
     <w:p>
       <w:pPr>
         <w:pStyle w:val="Bibliography"/>
@@ -8560,7 +11216,7 @@
       <w:r>
         <w:t xml:space="preserve"> </w:t>
       </w:r>
-      <w:hyperlink r:id="rId64">
+      <w:hyperlink r:id="rId76">
         <w:r>
           <w:rPr>
             <w:rStyle w:val="Hyperlink"/>
@@ -8569,8 +11225,8 @@
         </w:r>
       </w:hyperlink>
     </w:p>
-    <w:bookmarkEnd w:id="65"/>
-    <w:bookmarkStart w:id="67" w:name="ref-fiveminuteai_probstat"/>
+    <w:bookmarkEnd w:id="77"/>
+    <w:bookmarkStart w:id="79" w:name="ref-fiveminuteai_probstat"/>
     <w:p>
       <w:pPr>
         <w:pStyle w:val="Bibliography"/>
@@ -8602,7 +11258,7 @@
       <w:r>
         <w:t xml:space="preserve"> </w:t>
       </w:r>
-      <w:hyperlink r:id="rId66">
+      <w:hyperlink r:id="rId78">
         <w:r>
           <w:rPr>
             <w:rStyle w:val="Hyperlink"/>
@@ -8611,8 +11267,8 @@
         </w:r>
       </w:hyperlink>
     </w:p>
-    <w:bookmarkEnd w:id="67"/>
-    <w:bookmarkStart w:id="68" w:name="ref-hoggtanis2015"/>
+    <w:bookmarkEnd w:id="79"/>
+    <w:bookmarkStart w:id="80" w:name="ref-hoggtanis2015"/>
     <w:p>
       <w:pPr>
         <w:pStyle w:val="Bibliography"/>
@@ -8643,8 +11299,8 @@
         <w:t xml:space="preserve">, Tenth edition. Boston: Pearson, 2019.</w:t>
       </w:r>
     </w:p>
-    <w:bookmarkEnd w:id="68"/>
-    <w:bookmarkStart w:id="70" w:name="ref-CaseBerg01"/>
+    <w:bookmarkEnd w:id="80"/>
+    <w:bookmarkStart w:id="82" w:name="ref-CaseBerg01"/>
     <w:p>
       <w:pPr>
         <w:pStyle w:val="Bibliography"/>
@@ -8677,7 +11333,7 @@
       <w:r>
         <w:t xml:space="preserve"> </w:t>
       </w:r>
-      <w:hyperlink r:id="rId69">
+      <w:hyperlink r:id="rId81">
         <w:r>
           <w:rPr>
             <w:rStyle w:val="Hyperlink"/>
@@ -8686,8 +11342,8 @@
         </w:r>
       </w:hyperlink>
     </w:p>
-    <w:bookmarkEnd w:id="70"/>
-    <w:bookmarkStart w:id="71" w:name="ref-rice2007mathematical"/>
+    <w:bookmarkEnd w:id="82"/>
+    <w:bookmarkStart w:id="83" w:name="ref-rice2007mathematical"/>
     <w:p>
       <w:pPr>
         <w:pStyle w:val="Bibliography"/>
@@ -8718,8 +11374,8 @@
         <w:t xml:space="preserve">, 3rd ed. Belmont, CA: Cengage Learning, 2007.</w:t>
       </w:r>
     </w:p>
-    <w:bookmarkEnd w:id="71"/>
-    <w:bookmarkStart w:id="73" w:name="ref-wikipedia_chi_squared_distribution"/>
+    <w:bookmarkEnd w:id="83"/>
+    <w:bookmarkStart w:id="85" w:name="ref-wikipedia_chi_squared_distribution"/>
     <w:p>
       <w:pPr>
         <w:pStyle w:val="Bibliography"/>
@@ -8766,7 +11422,7 @@
       <w:r>
         <w:t xml:space="preserve"> </w:t>
       </w:r>
-      <w:hyperlink r:id="rId72">
+      <w:hyperlink r:id="rId84">
         <w:r>
           <w:rPr>
             <w:rStyle w:val="Hyperlink"/>
@@ -8775,8 +11431,8 @@
         </w:r>
       </w:hyperlink>
     </w:p>
-    <w:bookmarkEnd w:id="73"/>
-    <w:bookmarkStart w:id="75" w:name="ref-wikipedia_students_t_distribution"/>
+    <w:bookmarkEnd w:id="85"/>
+    <w:bookmarkStart w:id="87" w:name="ref-wikipedia_students_t_distribution"/>
     <w:p>
       <w:pPr>
         <w:pStyle w:val="Bibliography"/>
@@ -8823,7 +11479,7 @@
       <w:r>
         <w:t xml:space="preserve"> </w:t>
       </w:r>
-      <w:hyperlink r:id="rId74">
+      <w:hyperlink r:id="rId86">
         <w:r>
           <w:rPr>
             <w:rStyle w:val="Hyperlink"/>
@@ -8832,8 +11488,8 @@
         </w:r>
       </w:hyperlink>
     </w:p>
-    <w:bookmarkEnd w:id="75"/>
-    <w:bookmarkStart w:id="77" w:name="ref-wikipedia_confidence_interval"/>
+    <w:bookmarkEnd w:id="87"/>
+    <w:bookmarkStart w:id="89" w:name="ref-wikipedia_margin_of_error"/>
     <w:p>
       <w:pPr>
         <w:pStyle w:val="Bibliography"/>
@@ -8854,7 +11510,7 @@
         <w:t xml:space="preserve"> </w:t>
       </w:r>
       <w:r>
-        <w:t xml:space="preserve">“Confidence interval —</w:t>
+        <w:t xml:space="preserve">“Margin of error —</w:t>
       </w:r>
       <w:r>
         <w:t xml:space="preserve"> </w:t>
@@ -8880,121 +11536,7 @@
       <w:r>
         <w:t xml:space="preserve"> </w:t>
       </w:r>
-      <w:hyperlink r:id="rId76">
-        <w:r>
-          <w:rPr>
-            <w:rStyle w:val="Hyperlink"/>
-          </w:rPr>
-          <w:t xml:space="preserve">https://en.wikipedia.org/wiki/Confidence_interval</w:t>
-        </w:r>
-      </w:hyperlink>
-    </w:p>
-    <w:bookmarkEnd w:id="77"/>
-    <w:bookmarkStart w:id="79" w:name="ref-wikipedia_coverage_probability"/>
-    <w:p>
-      <w:pPr>
-        <w:pStyle w:val="Bibliography"/>
-      </w:pPr>
-      <w:r>
-        <w:t xml:space="preserve">[14]</w:t>
-      </w:r>
-      <w:r>
-        <w:t xml:space="preserve"> </w:t>
-      </w:r>
-      <w:r>
-        <w:t xml:space="preserve">	</w:t>
-      </w:r>
-      <w:r>
-        <w:t xml:space="preserve">Wikipedia contributors,</w:t>
-      </w:r>
-      <w:r>
-        <w:t xml:space="preserve"> </w:t>
-      </w:r>
-      <w:r>
-        <w:t xml:space="preserve">“Coverage probability —</w:t>
-      </w:r>
-      <w:r>
-        <w:t xml:space="preserve"> </w:t>
-      </w:r>
-      <w:r>
-        <w:t xml:space="preserve">Wikipedia</w:t>
-      </w:r>
-      <w:r>
-        <w:t xml:space="preserve">,</w:t>
-      </w:r>
-      <w:r>
-        <w:t xml:space="preserve"> </w:t>
-      </w:r>
-      <w:r>
-        <w:t xml:space="preserve">the free encyclopedia.”</w:t>
-      </w:r>
-      <w:r>
-        <w:t xml:space="preserve"> </w:t>
-      </w:r>
-      <w:r>
-        <w:t xml:space="preserve">2026. Available:</w:t>
-      </w:r>
-      <w:r>
-        <w:t xml:space="preserve"> </w:t>
-      </w:r>
-      <w:hyperlink r:id="rId78">
-        <w:r>
-          <w:rPr>
-            <w:rStyle w:val="Hyperlink"/>
-          </w:rPr>
-          <w:t xml:space="preserve">https://en.wikipedia.org/wiki/Coverage_probability</w:t>
-        </w:r>
-      </w:hyperlink>
-    </w:p>
-    <w:bookmarkEnd w:id="79"/>
-    <w:bookmarkStart w:id="81" w:name="ref-wikipedia_margin_of_error"/>
-    <w:p>
-      <w:pPr>
-        <w:pStyle w:val="Bibliography"/>
-      </w:pPr>
-      <w:r>
-        <w:t xml:space="preserve">[15]</w:t>
-      </w:r>
-      <w:r>
-        <w:t xml:space="preserve"> </w:t>
-      </w:r>
-      <w:r>
-        <w:t xml:space="preserve">	</w:t>
-      </w:r>
-      <w:r>
-        <w:t xml:space="preserve">Wikipedia contributors,</w:t>
-      </w:r>
-      <w:r>
-        <w:t xml:space="preserve"> </w:t>
-      </w:r>
-      <w:r>
-        <w:t xml:space="preserve">“Margin of error —</w:t>
-      </w:r>
-      <w:r>
-        <w:t xml:space="preserve"> </w:t>
-      </w:r>
-      <w:r>
-        <w:t xml:space="preserve">Wikipedia</w:t>
-      </w:r>
-      <w:r>
-        <w:t xml:space="preserve">,</w:t>
-      </w:r>
-      <w:r>
-        <w:t xml:space="preserve"> </w:t>
-      </w:r>
-      <w:r>
-        <w:t xml:space="preserve">the free encyclopedia.”</w:t>
-      </w:r>
-      <w:r>
-        <w:t xml:space="preserve"> </w:t>
-      </w:r>
-      <w:r>
-        <w:t xml:space="preserve">2026. Available:</w:t>
-      </w:r>
-      <w:r>
-        <w:t xml:space="preserve"> </w:t>
-      </w:r>
-      <w:hyperlink r:id="rId80">
+      <w:hyperlink r:id="rId88">
         <w:r>
           <w:rPr>
             <w:rStyle w:val="Hyperlink"/>
@@ -9003,14 +11545,14 @@
         </w:r>
       </w:hyperlink>
     </w:p>
-    <w:bookmarkEnd w:id="81"/>
-    <w:bookmarkStart w:id="83" w:name="ref-vittinghoff2e"/>
+    <w:bookmarkEnd w:id="89"/>
+    <w:bookmarkStart w:id="91" w:name="ref-vittinghoff2e"/>
     <w:p>
       <w:pPr>
         <w:pStyle w:val="Bibliography"/>
       </w:pPr>
       <w:r>
-        <w:t xml:space="preserve">[16]</w:t>
+        <w:t xml:space="preserve">[14]</w:t>
       </w:r>
       <w:r>
         <w:t xml:space="preserve"> </w:t>
@@ -9037,7 +11579,7 @@
       <w:r>
         <w:t xml:space="preserve"> </w:t>
       </w:r>
-      <w:hyperlink r:id="rId82">
+      <w:hyperlink r:id="rId90">
         <w:r>
           <w:rPr>
             <w:rStyle w:val="Hyperlink"/>
@@ -9049,9 +11591,9 @@
         <w:t xml:space="preserve">.</w:t>
       </w:r>
     </w:p>
-    <w:bookmarkEnd w:id="83"/>
-    <w:bookmarkEnd w:id="84"/>
-    <w:bookmarkEnd w:id="85"/>
+    <w:bookmarkEnd w:id="91"/>
+    <w:bookmarkEnd w:id="92"/>
+    <w:bookmarkEnd w:id="93"/>
     <w:sectPr>
       <w:footnotePr>
         <w:numRestart w:val="eachSect"/>

</xml_diff>